<commit_message>
Tài liệu Atlas 1.2: cập nhật toàn bộ, thêm 8 tài liệu, dựng từ nguồn Markdown
- Cập nhật ATL-00 → ATL-26 theo hệ thống hiện tại: công nợ theo đợt, trả hàng bán / trả lại
  hàng mua, khoá sổ, không chi vượt tồn quỹ, giá vốn bình quân chốt lúc xuất, giá bán tối thiểu,
  hạn mức công nợ, ngày chứng từ, xuất quá số tồn, xuất khẩu & ngoại tệ, hoá đơn xem trước,
  đổi mật khẩu bắt buộc, Tổng quan và Báo cáo mới, in A4/A5/K80, 113 quyền.
- Tài liệu mới: ATL-27 Nhật ký hoạt động, ATL-28 Báo giá, ATL-29 Bảng giá, ATL-30 Khuyến mãi,
  ATL-31 Nhắc nợ, ATL-32 Kho, ATL-33 Nhóm hàng, ATL-34 Quản trị nền tảng.
- Nguồn Markdown ở docs/atlas/src; tools/atlas/build.mjs dựng .docx, tools/atlas/page.mjs dựng
  trang HTML đọc toàn bộ tài liệu (không cần cài thêm gói).
- .gitignore: vẫn bỏ qua docs/ nhưng theo dõi docs/atlas.
</commit_message>
<xml_diff>
--- a/docs/atlas/ATL-01_Dang-nhap.docx
+++ b/docs/atlas/ATL-01_Dang-nhap.docx
@@ -1,6 +1,6 @@
 
 <file path=word/document.xml><?xml version="1.0" encoding="utf-8"?>
-<w:document xmlns:wpc="http://schemas.microsoft.com/office/word/2010/wordprocessingCanvas" xmlns:mc="http://schemas.openxmlformats.org/markup-compatibility/2006" xmlns:o="urn:schemas-microsoft-com:office:office" xmlns:r="http://schemas.openxmlformats.org/officeDocument/2006/relationships" xmlns:m="http://schemas.openxmlformats.org/officeDocument/2006/math" xmlns:v="urn:schemas-microsoft-com:vml" xmlns:wp14="http://schemas.microsoft.com/office/word/2010/wordprocessingDrawing" xmlns:wp="http://schemas.openxmlformats.org/drawingml/2006/wordprocessingDrawing" xmlns:w10="urn:schemas-microsoft-com:office:word" xmlns:w="http://schemas.openxmlformats.org/wordprocessingml/2006/main" xmlns:w14="http://schemas.microsoft.com/office/word/2010/wordml" xmlns:w15="http://schemas.microsoft.com/office/word/2012/wordml" xmlns:wpg="http://schemas.microsoft.com/office/word/2010/wordprocessingGroup" xmlns:wpi="http://schemas.microsoft.com/office/word/2010/wordprocessingInk" xmlns:wne="http://schemas.microsoft.com/office/word/2006/wordml" xmlns:wps="http://schemas.microsoft.com/office/word/2010/wordprocessingShape" xmlns:cx="http://schemas.microsoft.com/office/drawing/2014/chartex" xmlns:cx1="http://schemas.microsoft.com/office/drawing/2015/9/8/chartex" xmlns:cx2="http://schemas.microsoft.com/office/drawing/2015/10/21/chartex" xmlns:cx3="http://schemas.microsoft.com/office/drawing/2016/5/9/chartex" xmlns:cx4="http://schemas.microsoft.com/office/drawing/2016/5/10/chartex" xmlns:cx5="http://schemas.microsoft.com/office/drawing/2016/5/11/chartex" xmlns:cx6="http://schemas.microsoft.com/office/drawing/2016/5/12/chartex" xmlns:cx7="http://schemas.microsoft.com/office/drawing/2016/5/13/chartex" xmlns:cx8="http://schemas.microsoft.com/office/drawing/2016/5/14/chartex" xmlns:aink="http://schemas.microsoft.com/office/drawing/2016/ink" xmlns:am3d="http://schemas.microsoft.com/office/drawing/2017/model3d" xmlns:w16cex="http://schemas.microsoft.com/office/word/2018/wordml/cex" xmlns:w16cid="http://schemas.microsoft.com/office/word/2016/wordml/cid" xmlns:w16="http://schemas.microsoft.com/office/word/2018/wordml" xmlns:w16sdtdh="http://schemas.microsoft.com/office/word/2020/wordml/sdtdatahash" xmlns:w16se="http://schemas.microsoft.com/office/word/2015/wordml/symex" mc:Ignorable="w14 w15 wp14">
+<w:document xmlns:r="http://schemas.openxmlformats.org/officeDocument/2006/relationships" xmlns:w="http://schemas.openxmlformats.org/wordprocessingml/2006/main">
   <w:body>
     <w:p>
       <w:pPr>
@@ -246,7 +246,7 @@
                 <w:sz w:val="19"/>
                 <w:szCs w:val="19"/>
               </w:rPr>
-              <w:t xml:space="preserve">/login</w:t>
+              <w:t xml:space="preserve">/login, /doi-mat-khau</w:t>
             </w:r>
           </w:p>
         </w:tc>
@@ -313,7 +313,7 @@
                 <w:sz w:val="19"/>
                 <w:szCs w:val="19"/>
               </w:rPr>
-              <w:t xml:space="preserve">1.1 — 23/10/2026</w:t>
+              <w:t xml:space="preserve">1.2 — 29/10/2026</w:t>
             </w:r>
           </w:p>
         </w:tc>
@@ -386,11 +386,6 @@
         </w:tc>
       </w:tr>
     </w:tbl>
-    <w:p>
-      <w:pPr>
-        <w:spacing w:after="80"/>
-      </w:pPr>
-    </w:p>
     <w:p>
       <w:pPr>
         <w:pStyle w:val="Heading1"/>
@@ -437,7 +432,7 @@
           <w:sz w:val="21"/>
           <w:szCs w:val="21"/>
         </w:rPr>
-        <w:t xml:space="preserve">Cho người dùng đăng nhập vào hệ thống và giữ phiên làm việc. Mọi màn hình khác yêu cầu đã đăng nhập; chưa đăng nhập sẽ được chuyển về /login.</w:t>
+        <w:t xml:space="preserve">Cho người dùng đăng nhập vào hệ thống, giữ phiên làm việc và đổi mật khẩu. Mọi màn hình khác yêu cầu đã đăng nhập; chưa đăng nhập sẽ được chuyển về /login. Khi máy chủ chạy chế độ nhiều doanh nghiệp (ATL-34), màn đăng nhập hỏi thêm mã doanh nghiệp.</w:t>
       </w:r>
     </w:p>
     <w:p>
@@ -463,7 +458,7 @@
         <w:pStyle w:val="ListParagraph"/>
         <w:numPr>
           <w:ilvl w:val="0"/>
-          <w:numId w:val="2"/>
+          <w:numId w:val="1"/>
         </w:numPr>
         <w:spacing w:after="60" w:line="290"/>
       </w:pPr>
@@ -665,7 +660,7 @@
                 <w:sz w:val="18"/>
                 <w:szCs w:val="18"/>
               </w:rPr>
-              <w:t xml:space="preserve">Nhập email &amp; mật khẩu</w:t>
+              <w:t xml:space="preserve">(Mã doanh nghiệp) + email + mật khẩu</w:t>
             </w:r>
           </w:p>
         </w:tc>
@@ -803,7 +798,7 @@
                 <w:sz w:val="18"/>
                 <w:szCs w:val="18"/>
               </w:rPr>
-              <w:t xml:space="preserve">Vào Tổng quan</w:t>
+              <w:t xml:space="preserve">Đổi mật khẩu nếu bị buộc</w:t>
             </w:r>
           </w:p>
         </w:tc>
@@ -811,7 +806,83 @@
     </w:tbl>
     <w:p>
       <w:pPr>
-        <w:spacing w:after="80"/>
+        <w:spacing w:after="0" w:line="120" w:lineRule="exact"/>
+      </w:pPr>
+    </w:p>
+    <w:p>
+      <w:pPr>
+        <w:spacing w:after="40" w:before="40" w:line="300"/>
+        <w:jc w:val="center"/>
+      </w:pPr>
+      <w:r>
+        <w:rPr>
+          <w:rFonts w:ascii="Arial" w:cs="Arial" w:eastAsia="Arial" w:hAnsi="Arial"/>
+          <w:color w:val="7F7F7F"/>
+          <w:sz w:val="17"/>
+          <w:szCs w:val="17"/>
+        </w:rPr>
+        <w:t xml:space="preserve">↓ tiếp theo</w:t>
+      </w:r>
+    </w:p>
+    <w:tbl>
+      <w:tblPr>
+        <w:tblW w:type="dxa" w:w="9638"/>
+        <w:tblBorders>
+          <w:top w:val="single" w:color="auto" w:sz="4"/>
+          <w:left w:val="single" w:color="auto" w:sz="4"/>
+          <w:bottom w:val="single" w:color="auto" w:sz="4"/>
+          <w:right w:val="single" w:color="auto" w:sz="4"/>
+          <w:insideH w:val="single" w:color="auto" w:sz="4"/>
+          <w:insideV w:val="single" w:color="auto" w:sz="4"/>
+        </w:tblBorders>
+      </w:tblPr>
+      <w:tblGrid>
+        <w:gridCol w:w="9638"/>
+      </w:tblGrid>
+      <w:tr>
+        <w:trPr>
+          <w:cantSplit/>
+        </w:trPr>
+        <w:tc>
+          <w:tcPr>
+            <w:tcW w:type="dxa" w:w="9638"/>
+            <w:tcBorders>
+              <w:top w:val="single" w:color="A6A6A6" w:sz="4"/>
+              <w:left w:val="single" w:color="A6A6A6" w:sz="4"/>
+              <w:bottom w:val="single" w:color="A6A6A6" w:sz="4"/>
+              <w:right w:val="single" w:color="A6A6A6" w:sz="4"/>
+            </w:tcBorders>
+            <w:shd w:fill="DEEAF6" w:color="auto" w:val="clear"/>
+            <w:tcMar>
+              <w:top w:type="dxa" w:w="60"/>
+              <w:left w:type="dxa" w:w="100"/>
+              <w:bottom w:type="dxa" w:w="60"/>
+              <w:right w:type="dxa" w:w="100"/>
+            </w:tcMar>
+            <w:vAlign w:val="center"/>
+          </w:tcPr>
+          <w:p>
+            <w:pPr>
+              <w:spacing w:after="20" w:line="270"/>
+              <w:jc w:val="center"/>
+            </w:pPr>
+            <w:r>
+              <w:rPr>
+                <w:rFonts w:ascii="Arial" w:cs="Arial" w:eastAsia="Arial" w:hAnsi="Arial"/>
+                <w:b/>
+                <w:bCs/>
+                <w:sz w:val="18"/>
+                <w:szCs w:val="18"/>
+              </w:rPr>
+              <w:t xml:space="preserve">Vào Tổng quan</w:t>
+            </w:r>
+          </w:p>
+        </w:tc>
+      </w:tr>
+    </w:tbl>
+    <w:p>
+      <w:pPr>
+        <w:spacing w:after="0" w:line="120" w:lineRule="exact"/>
       </w:pPr>
     </w:p>
     <w:tbl>
@@ -827,10 +898,10 @@
         </w:tblBorders>
       </w:tblPr>
       <w:tblGrid>
-        <w:gridCol w:w="596"/>
-        <w:gridCol w:w="1490"/>
-        <w:gridCol w:w="3974"/>
-        <w:gridCol w:w="3578"/>
+        <w:gridCol w:w="660"/>
+        <w:gridCol w:w="1100"/>
+        <w:gridCol w:w="3265"/>
+        <w:gridCol w:w="4613"/>
       </w:tblGrid>
       <w:tr>
         <w:trPr>
@@ -839,7 +910,7 @@
         </w:trPr>
         <w:tc>
           <w:tcPr>
-            <w:tcW w:type="dxa" w:w="596"/>
+            <w:tcW w:type="dxa" w:w="660"/>
             <w:tcBorders>
               <w:top w:val="single" w:color="A6A6A6" w:sz="4"/>
               <w:left w:val="single" w:color="A6A6A6" w:sz="4"/>
@@ -873,7 +944,7 @@
         </w:tc>
         <w:tc>
           <w:tcPr>
-            <w:tcW w:type="dxa" w:w="1490"/>
+            <w:tcW w:type="dxa" w:w="1100"/>
             <w:tcBorders>
               <w:top w:val="single" w:color="A6A6A6" w:sz="4"/>
               <w:left w:val="single" w:color="A6A6A6" w:sz="4"/>
@@ -907,7 +978,7 @@
         </w:tc>
         <w:tc>
           <w:tcPr>
-            <w:tcW w:type="dxa" w:w="3974"/>
+            <w:tcW w:type="dxa" w:w="3265"/>
             <w:tcBorders>
               <w:top w:val="single" w:color="A6A6A6" w:sz="4"/>
               <w:left w:val="single" w:color="A6A6A6" w:sz="4"/>
@@ -941,7 +1012,7 @@
         </w:tc>
         <w:tc>
           <w:tcPr>
-            <w:tcW w:type="dxa" w:w="3578"/>
+            <w:tcW w:type="dxa" w:w="4613"/>
             <w:tcBorders>
               <w:top w:val="single" w:color="A6A6A6" w:sz="4"/>
               <w:left w:val="single" w:color="A6A6A6" w:sz="4"/>
@@ -980,7 +1051,7 @@
         </w:trPr>
         <w:tc>
           <w:tcPr>
-            <w:tcW w:type="dxa" w:w="596"/>
+            <w:tcW w:type="dxa" w:w="660"/>
             <w:tcBorders>
               <w:top w:val="single" w:color="A6A6A6" w:sz="4"/>
               <w:left w:val="single" w:color="A6A6A6" w:sz="4"/>
@@ -1011,7 +1082,7 @@
         </w:tc>
         <w:tc>
           <w:tcPr>
-            <w:tcW w:type="dxa" w:w="1490"/>
+            <w:tcW w:type="dxa" w:w="1100"/>
             <w:tcBorders>
               <w:top w:val="single" w:color="A6A6A6" w:sz="4"/>
               <w:left w:val="single" w:color="A6A6A6" w:sz="4"/>
@@ -1042,7 +1113,7 @@
         </w:tc>
         <w:tc>
           <w:tcPr>
-            <w:tcW w:type="dxa" w:w="3974"/>
+            <w:tcW w:type="dxa" w:w="3265"/>
             <w:tcBorders>
               <w:top w:val="single" w:color="A6A6A6" w:sz="4"/>
               <w:left w:val="single" w:color="A6A6A6" w:sz="4"/>
@@ -1073,32 +1144,32 @@
         </w:tc>
         <w:tc>
           <w:tcPr>
-            <w:tcW w:type="dxa" w:w="3578"/>
-            <w:tcBorders>
-              <w:top w:val="single" w:color="A6A6A6" w:sz="4"/>
-              <w:left w:val="single" w:color="A6A6A6" w:sz="4"/>
-              <w:bottom w:val="single" w:color="A6A6A6" w:sz="4"/>
-              <w:right w:val="single" w:color="A6A6A6" w:sz="4"/>
-            </w:tcBorders>
-            <w:tcMar>
-              <w:top w:type="dxa" w:w="60"/>
-              <w:left w:type="dxa" w:w="100"/>
-              <w:bottom w:type="dxa" w:w="60"/>
-              <w:right w:type="dxa" w:w="100"/>
-            </w:tcMar>
-            <w:vAlign w:val="top"/>
-          </w:tcPr>
-          <w:p>
-            <w:pPr>
-              <w:spacing w:after="20" w:line="270"/>
-            </w:pPr>
-            <w:r>
-              <w:rPr>
-                <w:rFonts w:ascii="Arial" w:cs="Arial" w:eastAsia="Arial" w:hAnsi="Arial"/>
-                <w:sz w:val="19"/>
-                <w:szCs w:val="19"/>
-              </w:rPr>
-              <w:t xml:space="preserve">Chưa có phiên → chuyển tới /login.</w:t>
+            <w:tcW w:type="dxa" w:w="4613"/>
+            <w:tcBorders>
+              <w:top w:val="single" w:color="A6A6A6" w:sz="4"/>
+              <w:left w:val="single" w:color="A6A6A6" w:sz="4"/>
+              <w:bottom w:val="single" w:color="A6A6A6" w:sz="4"/>
+              <w:right w:val="single" w:color="A6A6A6" w:sz="4"/>
+            </w:tcBorders>
+            <w:tcMar>
+              <w:top w:type="dxa" w:w="60"/>
+              <w:left w:type="dxa" w:w="100"/>
+              <w:bottom w:type="dxa" w:w="60"/>
+              <w:right w:type="dxa" w:w="100"/>
+            </w:tcMar>
+            <w:vAlign w:val="top"/>
+          </w:tcPr>
+          <w:p>
+            <w:pPr>
+              <w:spacing w:after="20" w:line="270"/>
+            </w:pPr>
+            <w:r>
+              <w:rPr>
+                <w:rFonts w:ascii="Arial" w:cs="Arial" w:eastAsia="Arial" w:hAnsi="Arial"/>
+                <w:sz w:val="19"/>
+                <w:szCs w:val="19"/>
+              </w:rPr>
+              <w:t xml:space="preserve">Màn khởi động (theo chủ đề sáng / tối và thương hiệu đã nhớ) hiện trong lúc tải; chưa có phiên → chuyển tới /login.</w:t>
             </w:r>
           </w:p>
         </w:tc>
@@ -1109,7 +1180,7 @@
         </w:trPr>
         <w:tc>
           <w:tcPr>
-            <w:tcW w:type="dxa" w:w="596"/>
+            <w:tcW w:type="dxa" w:w="660"/>
             <w:tcBorders>
               <w:top w:val="single" w:color="A6A6A6" w:sz="4"/>
               <w:left w:val="single" w:color="A6A6A6" w:sz="4"/>
@@ -1140,7 +1211,7 @@
         </w:tc>
         <w:tc>
           <w:tcPr>
-            <w:tcW w:type="dxa" w:w="1490"/>
+            <w:tcW w:type="dxa" w:w="1100"/>
             <w:tcBorders>
               <w:top w:val="single" w:color="A6A6A6" w:sz="4"/>
               <w:left w:val="single" w:color="A6A6A6" w:sz="4"/>
@@ -1171,63 +1242,63 @@
         </w:tc>
         <w:tc>
           <w:tcPr>
-            <w:tcW w:type="dxa" w:w="3974"/>
-            <w:tcBorders>
-              <w:top w:val="single" w:color="A6A6A6" w:sz="4"/>
-              <w:left w:val="single" w:color="A6A6A6" w:sz="4"/>
-              <w:bottom w:val="single" w:color="A6A6A6" w:sz="4"/>
-              <w:right w:val="single" w:color="A6A6A6" w:sz="4"/>
-            </w:tcBorders>
-            <w:tcMar>
-              <w:top w:type="dxa" w:w="60"/>
-              <w:left w:type="dxa" w:w="100"/>
-              <w:bottom w:type="dxa" w:w="60"/>
-              <w:right w:type="dxa" w:w="100"/>
-            </w:tcMar>
-            <w:vAlign w:val="top"/>
-          </w:tcPr>
-          <w:p>
-            <w:pPr>
-              <w:spacing w:after="20" w:line="270"/>
-            </w:pPr>
-            <w:r>
-              <w:rPr>
-                <w:rFonts w:ascii="Arial" w:cs="Arial" w:eastAsia="Arial" w:hAnsi="Arial"/>
-                <w:sz w:val="19"/>
-                <w:szCs w:val="19"/>
-              </w:rPr>
-              <w:t xml:space="preserve">Nhập email và mật khẩu, bấm Đăng nhập.</w:t>
-            </w:r>
-          </w:p>
-        </w:tc>
-        <w:tc>
-          <w:tcPr>
-            <w:tcW w:type="dxa" w:w="3578"/>
-            <w:tcBorders>
-              <w:top w:val="single" w:color="A6A6A6" w:sz="4"/>
-              <w:left w:val="single" w:color="A6A6A6" w:sz="4"/>
-              <w:bottom w:val="single" w:color="A6A6A6" w:sz="4"/>
-              <w:right w:val="single" w:color="A6A6A6" w:sz="4"/>
-            </w:tcBorders>
-            <w:tcMar>
-              <w:top w:type="dxa" w:w="60"/>
-              <w:left w:type="dxa" w:w="100"/>
-              <w:bottom w:type="dxa" w:w="60"/>
-              <w:right w:type="dxa" w:w="100"/>
-            </w:tcMar>
-            <w:vAlign w:val="top"/>
-          </w:tcPr>
-          <w:p>
-            <w:pPr>
-              <w:spacing w:after="20" w:line="270"/>
-            </w:pPr>
-            <w:r>
-              <w:rPr>
-                <w:rFonts w:ascii="Arial" w:cs="Arial" w:eastAsia="Arial" w:hAnsi="Arial"/>
-                <w:sz w:val="19"/>
-                <w:szCs w:val="19"/>
-              </w:rPr>
-              <w:t xml:space="preserve">Hệ thống kiểm tra tài khoản.</w:t>
+            <w:tcW w:type="dxa" w:w="3265"/>
+            <w:tcBorders>
+              <w:top w:val="single" w:color="A6A6A6" w:sz="4"/>
+              <w:left w:val="single" w:color="A6A6A6" w:sz="4"/>
+              <w:bottom w:val="single" w:color="A6A6A6" w:sz="4"/>
+              <w:right w:val="single" w:color="A6A6A6" w:sz="4"/>
+            </w:tcBorders>
+            <w:tcMar>
+              <w:top w:type="dxa" w:w="60"/>
+              <w:left w:type="dxa" w:w="100"/>
+              <w:bottom w:type="dxa" w:w="60"/>
+              <w:right w:type="dxa" w:w="100"/>
+            </w:tcMar>
+            <w:vAlign w:val="top"/>
+          </w:tcPr>
+          <w:p>
+            <w:pPr>
+              <w:spacing w:after="20" w:line="270"/>
+            </w:pPr>
+            <w:r>
+              <w:rPr>
+                <w:rFonts w:ascii="Arial" w:cs="Arial" w:eastAsia="Arial" w:hAnsi="Arial"/>
+                <w:sz w:val="19"/>
+                <w:szCs w:val="19"/>
+              </w:rPr>
+              <w:t xml:space="preserve">Nhập mã doanh nghiệp (chỉ khi bật nhiều doanh nghiệp; đường dẫn …/login?dn=&lt;mã&gt; điền sẵn), email và mật khẩu, bấm Đăng nhập.</w:t>
+            </w:r>
+          </w:p>
+        </w:tc>
+        <w:tc>
+          <w:tcPr>
+            <w:tcW w:type="dxa" w:w="4613"/>
+            <w:tcBorders>
+              <w:top w:val="single" w:color="A6A6A6" w:sz="4"/>
+              <w:left w:val="single" w:color="A6A6A6" w:sz="4"/>
+              <w:bottom w:val="single" w:color="A6A6A6" w:sz="4"/>
+              <w:right w:val="single" w:color="A6A6A6" w:sz="4"/>
+            </w:tcBorders>
+            <w:tcMar>
+              <w:top w:type="dxa" w:w="60"/>
+              <w:left w:type="dxa" w:w="100"/>
+              <w:bottom w:type="dxa" w:w="60"/>
+              <w:right w:type="dxa" w:w="100"/>
+            </w:tcMar>
+            <w:vAlign w:val="top"/>
+          </w:tcPr>
+          <w:p>
+            <w:pPr>
+              <w:spacing w:after="20" w:line="270"/>
+            </w:pPr>
+            <w:r>
+              <w:rPr>
+                <w:rFonts w:ascii="Arial" w:cs="Arial" w:eastAsia="Arial" w:hAnsi="Arial"/>
+                <w:sz w:val="19"/>
+                <w:szCs w:val="19"/>
+              </w:rPr>
+              <w:t xml:space="preserve">Trình duyệt nhớ mã doanh nghiệp cho lần sau; máy chủ kiểm tra tài khoản.</w:t>
             </w:r>
           </w:p>
         </w:tc>
@@ -1238,7 +1309,7 @@
         </w:trPr>
         <w:tc>
           <w:tcPr>
-            <w:tcW w:type="dxa" w:w="596"/>
+            <w:tcW w:type="dxa" w:w="660"/>
             <w:tcBorders>
               <w:top w:val="single" w:color="A6A6A6" w:sz="4"/>
               <w:left w:val="single" w:color="A6A6A6" w:sz="4"/>
@@ -1269,7 +1340,7 @@
         </w:tc>
         <w:tc>
           <w:tcPr>
-            <w:tcW w:type="dxa" w:w="1490"/>
+            <w:tcW w:type="dxa" w:w="1100"/>
             <w:tcBorders>
               <w:top w:val="single" w:color="A6A6A6" w:sz="4"/>
               <w:left w:val="single" w:color="A6A6A6" w:sz="4"/>
@@ -1300,7 +1371,7 @@
         </w:tc>
         <w:tc>
           <w:tcPr>
-            <w:tcW w:type="dxa" w:w="3974"/>
+            <w:tcW w:type="dxa" w:w="3265"/>
             <w:tcBorders>
               <w:top w:val="single" w:color="A6A6A6" w:sz="4"/>
               <w:left w:val="single" w:color="A6A6A6" w:sz="4"/>
@@ -1331,32 +1402,32 @@
         </w:tc>
         <w:tc>
           <w:tcPr>
-            <w:tcW w:type="dxa" w:w="3578"/>
-            <w:tcBorders>
-              <w:top w:val="single" w:color="A6A6A6" w:sz="4"/>
-              <w:left w:val="single" w:color="A6A6A6" w:sz="4"/>
-              <w:bottom w:val="single" w:color="A6A6A6" w:sz="4"/>
-              <w:right w:val="single" w:color="A6A6A6" w:sz="4"/>
-            </w:tcBorders>
-            <w:tcMar>
-              <w:top w:type="dxa" w:w="60"/>
-              <w:left w:type="dxa" w:w="100"/>
-              <w:bottom w:type="dxa" w:w="60"/>
-              <w:right w:type="dxa" w:w="100"/>
-            </w:tcMar>
-            <w:vAlign w:val="top"/>
-          </w:tcPr>
-          <w:p>
-            <w:pPr>
-              <w:spacing w:after="20" w:line="270"/>
-            </w:pPr>
-            <w:r>
-              <w:rPr>
-                <w:rFonts w:ascii="Arial" w:cs="Arial" w:eastAsia="Arial" w:hAnsi="Arial"/>
-                <w:sz w:val="19"/>
-                <w:szCs w:val="19"/>
-              </w:rPr>
-              <w:t xml:space="preserve">Lưu phiên, chuyển tới /tong-quan; tên và chức vụ hiện ở góc trên phải.</w:t>
+            <w:tcW w:type="dxa" w:w="4613"/>
+            <w:tcBorders>
+              <w:top w:val="single" w:color="A6A6A6" w:sz="4"/>
+              <w:left w:val="single" w:color="A6A6A6" w:sz="4"/>
+              <w:bottom w:val="single" w:color="A6A6A6" w:sz="4"/>
+              <w:right w:val="single" w:color="A6A6A6" w:sz="4"/>
+            </w:tcBorders>
+            <w:tcMar>
+              <w:top w:type="dxa" w:w="60"/>
+              <w:left w:type="dxa" w:w="100"/>
+              <w:bottom w:type="dxa" w:w="60"/>
+              <w:right w:type="dxa" w:w="100"/>
+            </w:tcMar>
+            <w:vAlign w:val="top"/>
+          </w:tcPr>
+          <w:p>
+            <w:pPr>
+              <w:spacing w:after="20" w:line="270"/>
+            </w:pPr>
+            <w:r>
+              <w:rPr>
+                <w:rFonts w:ascii="Arial" w:cs="Arial" w:eastAsia="Arial" w:hAnsi="Arial"/>
+                <w:sz w:val="19"/>
+                <w:szCs w:val="19"/>
+              </w:rPr>
+              <w:t xml:space="preserve">Lưu phiên, nạp danh mục (màn tải có tiến độ từng bước), chuyển tới /tong-quan hoặc trang đang mở trước đó.</w:t>
             </w:r>
           </w:p>
         </w:tc>
@@ -1367,7 +1438,7 @@
         </w:trPr>
         <w:tc>
           <w:tcPr>
-            <w:tcW w:type="dxa" w:w="596"/>
+            <w:tcW w:type="dxa" w:w="660"/>
             <w:tcBorders>
               <w:top w:val="single" w:color="A6A6A6" w:sz="4"/>
               <w:left w:val="single" w:color="A6A6A6" w:sz="4"/>
@@ -1398,7 +1469,136 @@
         </w:tc>
         <w:tc>
           <w:tcPr>
-            <w:tcW w:type="dxa" w:w="1490"/>
+            <w:tcW w:type="dxa" w:w="1100"/>
+            <w:tcBorders>
+              <w:top w:val="single" w:color="A6A6A6" w:sz="4"/>
+              <w:left w:val="single" w:color="A6A6A6" w:sz="4"/>
+              <w:bottom w:val="single" w:color="A6A6A6" w:sz="4"/>
+              <w:right w:val="single" w:color="A6A6A6" w:sz="4"/>
+            </w:tcBorders>
+            <w:tcMar>
+              <w:top w:type="dxa" w:w="60"/>
+              <w:left w:type="dxa" w:w="100"/>
+              <w:bottom w:type="dxa" w:w="60"/>
+              <w:right w:type="dxa" w:w="100"/>
+            </w:tcMar>
+            <w:vAlign w:val="top"/>
+          </w:tcPr>
+          <w:p>
+            <w:pPr>
+              <w:spacing w:after="20" w:line="270"/>
+            </w:pPr>
+            <w:r>
+              <w:rPr>
+                <w:rFonts w:ascii="Arial" w:cs="Arial" w:eastAsia="Arial" w:hAnsi="Arial"/>
+                <w:sz w:val="19"/>
+                <w:szCs w:val="19"/>
+              </w:rPr>
+              <w:t xml:space="preserve">Hệ thống</w:t>
+            </w:r>
+          </w:p>
+        </w:tc>
+        <w:tc>
+          <w:tcPr>
+            <w:tcW w:type="dxa" w:w="3265"/>
+            <w:tcBorders>
+              <w:top w:val="single" w:color="A6A6A6" w:sz="4"/>
+              <w:left w:val="single" w:color="A6A6A6" w:sz="4"/>
+              <w:bottom w:val="single" w:color="A6A6A6" w:sz="4"/>
+              <w:right w:val="single" w:color="A6A6A6" w:sz="4"/>
+            </w:tcBorders>
+            <w:tcMar>
+              <w:top w:type="dxa" w:w="60"/>
+              <w:left w:type="dxa" w:w="100"/>
+              <w:bottom w:type="dxa" w:w="60"/>
+              <w:right w:type="dxa" w:w="100"/>
+            </w:tcMar>
+            <w:vAlign w:val="top"/>
+          </w:tcPr>
+          <w:p>
+            <w:pPr>
+              <w:spacing w:after="20" w:line="270"/>
+            </w:pPr>
+            <w:r>
+              <w:rPr>
+                <w:rFonts w:ascii="Arial" w:cs="Arial" w:eastAsia="Arial" w:hAnsi="Arial"/>
+                <w:sz w:val="19"/>
+                <w:szCs w:val="19"/>
+              </w:rPr>
+              <w:t xml:space="preserve">Tài khoản đang bị buộc đổi mật khẩu (mật khẩu do quản trị cấp).</w:t>
+            </w:r>
+          </w:p>
+        </w:tc>
+        <w:tc>
+          <w:tcPr>
+            <w:tcW w:type="dxa" w:w="4613"/>
+            <w:tcBorders>
+              <w:top w:val="single" w:color="A6A6A6" w:sz="4"/>
+              <w:left w:val="single" w:color="A6A6A6" w:sz="4"/>
+              <w:bottom w:val="single" w:color="A6A6A6" w:sz="4"/>
+              <w:right w:val="single" w:color="A6A6A6" w:sz="4"/>
+            </w:tcBorders>
+            <w:tcMar>
+              <w:top w:type="dxa" w:w="60"/>
+              <w:left w:type="dxa" w:w="100"/>
+              <w:bottom w:type="dxa" w:w="60"/>
+              <w:right w:type="dxa" w:w="100"/>
+            </w:tcMar>
+            <w:vAlign w:val="top"/>
+          </w:tcPr>
+          <w:p>
+            <w:pPr>
+              <w:spacing w:after="20" w:line="270"/>
+            </w:pPr>
+            <w:r>
+              <w:rPr>
+                <w:rFonts w:ascii="Arial" w:cs="Arial" w:eastAsia="Arial" w:hAnsi="Arial"/>
+                <w:sz w:val="19"/>
+                <w:szCs w:val="19"/>
+              </w:rPr>
+              <w:t xml:space="preserve">Chuyển tới /doi-mat-khau; chưa đổi thì máy chủ chặn mọi thao tác khác.</w:t>
+            </w:r>
+          </w:p>
+        </w:tc>
+      </w:tr>
+      <w:tr>
+        <w:trPr>
+          <w:cantSplit/>
+        </w:trPr>
+        <w:tc>
+          <w:tcPr>
+            <w:tcW w:type="dxa" w:w="660"/>
+            <w:tcBorders>
+              <w:top w:val="single" w:color="A6A6A6" w:sz="4"/>
+              <w:left w:val="single" w:color="A6A6A6" w:sz="4"/>
+              <w:bottom w:val="single" w:color="A6A6A6" w:sz="4"/>
+              <w:right w:val="single" w:color="A6A6A6" w:sz="4"/>
+            </w:tcBorders>
+            <w:tcMar>
+              <w:top w:type="dxa" w:w="60"/>
+              <w:left w:type="dxa" w:w="100"/>
+              <w:bottom w:type="dxa" w:w="60"/>
+              <w:right w:type="dxa" w:w="100"/>
+            </w:tcMar>
+            <w:vAlign w:val="top"/>
+          </w:tcPr>
+          <w:p>
+            <w:pPr>
+              <w:spacing w:after="20" w:line="270"/>
+            </w:pPr>
+            <w:r>
+              <w:rPr>
+                <w:rFonts w:ascii="Arial" w:cs="Arial" w:eastAsia="Arial" w:hAnsi="Arial"/>
+                <w:sz w:val="19"/>
+                <w:szCs w:val="19"/>
+              </w:rPr>
+              <w:t xml:space="preserve">5</w:t>
+            </w:r>
+          </w:p>
+        </w:tc>
+        <w:tc>
+          <w:tcPr>
+            <w:tcW w:type="dxa" w:w="1100"/>
             <w:tcBorders>
               <w:top w:val="single" w:color="A6A6A6" w:sz="4"/>
               <w:left w:val="single" w:color="A6A6A6" w:sz="4"/>
@@ -1429,7 +1629,136 @@
         </w:tc>
         <w:tc>
           <w:tcPr>
-            <w:tcW w:type="dxa" w:w="3974"/>
+            <w:tcW w:type="dxa" w:w="3265"/>
+            <w:tcBorders>
+              <w:top w:val="single" w:color="A6A6A6" w:sz="4"/>
+              <w:left w:val="single" w:color="A6A6A6" w:sz="4"/>
+              <w:bottom w:val="single" w:color="A6A6A6" w:sz="4"/>
+              <w:right w:val="single" w:color="A6A6A6" w:sz="4"/>
+            </w:tcBorders>
+            <w:tcMar>
+              <w:top w:type="dxa" w:w="60"/>
+              <w:left w:type="dxa" w:w="100"/>
+              <w:bottom w:type="dxa" w:w="60"/>
+              <w:right w:type="dxa" w:w="100"/>
+            </w:tcMar>
+            <w:vAlign w:val="top"/>
+          </w:tcPr>
+          <w:p>
+            <w:pPr>
+              <w:spacing w:after="20" w:line="270"/>
+            </w:pPr>
+            <w:r>
+              <w:rPr>
+                <w:rFonts w:ascii="Arial" w:cs="Arial" w:eastAsia="Arial" w:hAnsi="Arial"/>
+                <w:sz w:val="19"/>
+                <w:szCs w:val="19"/>
+              </w:rPr>
+              <w:t xml:space="preserve">Đổi mật khẩu: mật khẩu hiện tại, mật khẩu mới, nhập lại.</w:t>
+            </w:r>
+          </w:p>
+        </w:tc>
+        <w:tc>
+          <w:tcPr>
+            <w:tcW w:type="dxa" w:w="4613"/>
+            <w:tcBorders>
+              <w:top w:val="single" w:color="A6A6A6" w:sz="4"/>
+              <w:left w:val="single" w:color="A6A6A6" w:sz="4"/>
+              <w:bottom w:val="single" w:color="A6A6A6" w:sz="4"/>
+              <w:right w:val="single" w:color="A6A6A6" w:sz="4"/>
+            </w:tcBorders>
+            <w:tcMar>
+              <w:top w:type="dxa" w:w="60"/>
+              <w:left w:type="dxa" w:w="100"/>
+              <w:bottom w:type="dxa" w:w="60"/>
+              <w:right w:type="dxa" w:w="100"/>
+            </w:tcMar>
+            <w:vAlign w:val="top"/>
+          </w:tcPr>
+          <w:p>
+            <w:pPr>
+              <w:spacing w:after="20" w:line="270"/>
+            </w:pPr>
+            <w:r>
+              <w:rPr>
+                <w:rFonts w:ascii="Arial" w:cs="Arial" w:eastAsia="Arial" w:hAnsi="Arial"/>
+                <w:sz w:val="19"/>
+                <w:szCs w:val="19"/>
+              </w:rPr>
+              <w:t xml:space="preserve">Lưu mật khẩu mới; vào hệ thống bình thường. Có thể tự mở trang này từ menu tài khoản bất kỳ lúc nào.</w:t>
+            </w:r>
+          </w:p>
+        </w:tc>
+      </w:tr>
+      <w:tr>
+        <w:trPr>
+          <w:cantSplit/>
+        </w:trPr>
+        <w:tc>
+          <w:tcPr>
+            <w:tcW w:type="dxa" w:w="660"/>
+            <w:tcBorders>
+              <w:top w:val="single" w:color="A6A6A6" w:sz="4"/>
+              <w:left w:val="single" w:color="A6A6A6" w:sz="4"/>
+              <w:bottom w:val="single" w:color="A6A6A6" w:sz="4"/>
+              <w:right w:val="single" w:color="A6A6A6" w:sz="4"/>
+            </w:tcBorders>
+            <w:tcMar>
+              <w:top w:type="dxa" w:w="60"/>
+              <w:left w:type="dxa" w:w="100"/>
+              <w:bottom w:type="dxa" w:w="60"/>
+              <w:right w:type="dxa" w:w="100"/>
+            </w:tcMar>
+            <w:vAlign w:val="top"/>
+          </w:tcPr>
+          <w:p>
+            <w:pPr>
+              <w:spacing w:after="20" w:line="270"/>
+            </w:pPr>
+            <w:r>
+              <w:rPr>
+                <w:rFonts w:ascii="Arial" w:cs="Arial" w:eastAsia="Arial" w:hAnsi="Arial"/>
+                <w:sz w:val="19"/>
+                <w:szCs w:val="19"/>
+              </w:rPr>
+              <w:t xml:space="preserve">6</w:t>
+            </w:r>
+          </w:p>
+        </w:tc>
+        <w:tc>
+          <w:tcPr>
+            <w:tcW w:type="dxa" w:w="1100"/>
+            <w:tcBorders>
+              <w:top w:val="single" w:color="A6A6A6" w:sz="4"/>
+              <w:left w:val="single" w:color="A6A6A6" w:sz="4"/>
+              <w:bottom w:val="single" w:color="A6A6A6" w:sz="4"/>
+              <w:right w:val="single" w:color="A6A6A6" w:sz="4"/>
+            </w:tcBorders>
+            <w:tcMar>
+              <w:top w:type="dxa" w:w="60"/>
+              <w:left w:type="dxa" w:w="100"/>
+              <w:bottom w:type="dxa" w:w="60"/>
+              <w:right w:type="dxa" w:w="100"/>
+            </w:tcMar>
+            <w:vAlign w:val="top"/>
+          </w:tcPr>
+          <w:p>
+            <w:pPr>
+              <w:spacing w:after="20" w:line="270"/>
+            </w:pPr>
+            <w:r>
+              <w:rPr>
+                <w:rFonts w:ascii="Arial" w:cs="Arial" w:eastAsia="Arial" w:hAnsi="Arial"/>
+                <w:sz w:val="19"/>
+                <w:szCs w:val="19"/>
+              </w:rPr>
+              <w:t xml:space="preserve">Người dùng</w:t>
+            </w:r>
+          </w:p>
+        </w:tc>
+        <w:tc>
+          <w:tcPr>
+            <w:tcW w:type="dxa" w:w="3265"/>
             <w:tcBorders>
               <w:top w:val="single" w:color="A6A6A6" w:sz="4"/>
               <w:left w:val="single" w:color="A6A6A6" w:sz="4"/>
@@ -1460,7 +1789,7 @@
         </w:tc>
         <w:tc>
           <w:tcPr>
-            <w:tcW w:type="dxa" w:w="3578"/>
+            <w:tcW w:type="dxa" w:w="4613"/>
             <w:tcBorders>
               <w:top w:val="single" w:color="A6A6A6" w:sz="4"/>
               <w:left w:val="single" w:color="A6A6A6" w:sz="4"/>
@@ -1491,6 +1820,11 @@
         </w:tc>
       </w:tr>
     </w:tbl>
+    <w:p>
+      <w:pPr>
+        <w:spacing w:after="60"/>
+      </w:pPr>
+    </w:p>
     <w:p>
       <w:pPr>
         <w:pStyle w:val="Heading1"/>
@@ -1522,8 +1856,8 @@
         </w:tblBorders>
       </w:tblPr>
       <w:tblGrid>
-        <w:gridCol w:w="2409"/>
-        <w:gridCol w:w="7229"/>
+        <w:gridCol w:w="1430"/>
+        <w:gridCol w:w="8208"/>
       </w:tblGrid>
       <w:tr>
         <w:trPr>
@@ -1532,7 +1866,7 @@
         </w:trPr>
         <w:tc>
           <w:tcPr>
-            <w:tcW w:type="dxa" w:w="2409"/>
+            <w:tcW w:type="dxa" w:w="1430"/>
             <w:tcBorders>
               <w:top w:val="single" w:color="A6A6A6" w:sz="4"/>
               <w:left w:val="single" w:color="A6A6A6" w:sz="4"/>
@@ -1566,7 +1900,7 @@
         </w:tc>
         <w:tc>
           <w:tcPr>
-            <w:tcW w:type="dxa" w:w="7229"/>
+            <w:tcW w:type="dxa" w:w="8208"/>
             <w:tcBorders>
               <w:top w:val="single" w:color="A6A6A6" w:sz="4"/>
               <w:left w:val="single" w:color="A6A6A6" w:sz="4"/>
@@ -1605,7 +1939,7 @@
         </w:trPr>
         <w:tc>
           <w:tcPr>
-            <w:tcW w:type="dxa" w:w="2409"/>
+            <w:tcW w:type="dxa" w:w="1430"/>
             <w:tcBorders>
               <w:top w:val="single" w:color="A6A6A6" w:sz="4"/>
               <w:left w:val="single" w:color="A6A6A6" w:sz="4"/>
@@ -1636,32 +1970,32 @@
         </w:tc>
         <w:tc>
           <w:tcPr>
-            <w:tcW w:type="dxa" w:w="7229"/>
-            <w:tcBorders>
-              <w:top w:val="single" w:color="A6A6A6" w:sz="4"/>
-              <w:left w:val="single" w:color="A6A6A6" w:sz="4"/>
-              <w:bottom w:val="single" w:color="A6A6A6" w:sz="4"/>
-              <w:right w:val="single" w:color="A6A6A6" w:sz="4"/>
-            </w:tcBorders>
-            <w:tcMar>
-              <w:top w:type="dxa" w:w="60"/>
-              <w:left w:type="dxa" w:w="100"/>
-              <w:bottom w:type="dxa" w:w="60"/>
-              <w:right w:type="dxa" w:w="100"/>
-            </w:tcMar>
-            <w:vAlign w:val="top"/>
-          </w:tcPr>
-          <w:p>
-            <w:pPr>
-              <w:spacing w:after="20" w:line="270"/>
-            </w:pPr>
-            <w:r>
-              <w:rPr>
-                <w:rFonts w:ascii="Arial" w:cs="Arial" w:eastAsia="Arial" w:hAnsi="Arial"/>
-                <w:sz w:val="19"/>
-                <w:szCs w:val="19"/>
-              </w:rPr>
-              <w:t xml:space="preserve">Hai ô email và mật khẩu, nút Đăng nhập, thông báo lỗi khi sai thông tin.</w:t>
+            <w:tcW w:type="dxa" w:w="8208"/>
+            <w:tcBorders>
+              <w:top w:val="single" w:color="A6A6A6" w:sz="4"/>
+              <w:left w:val="single" w:color="A6A6A6" w:sz="4"/>
+              <w:bottom w:val="single" w:color="A6A6A6" w:sz="4"/>
+              <w:right w:val="single" w:color="A6A6A6" w:sz="4"/>
+            </w:tcBorders>
+            <w:tcMar>
+              <w:top w:type="dxa" w:w="60"/>
+              <w:left w:type="dxa" w:w="100"/>
+              <w:bottom w:type="dxa" w:w="60"/>
+              <w:right w:type="dxa" w:w="100"/>
+            </w:tcMar>
+            <w:vAlign w:val="top"/>
+          </w:tcPr>
+          <w:p>
+            <w:pPr>
+              <w:spacing w:after="20" w:line="270"/>
+            </w:pPr>
+            <w:r>
+              <w:rPr>
+                <w:rFonts w:ascii="Arial" w:cs="Arial" w:eastAsia="Arial" w:hAnsi="Arial"/>
+                <w:sz w:val="19"/>
+                <w:szCs w:val="19"/>
+              </w:rPr>
+              <w:t xml:space="preserve">Logo / tên doanh nghiệp đã biết; ô Mã doanh nghiệp (khi bật nhiều doanh nghiệp, gợi ý "Trình duyệt này sẽ nhớ mã cho lần sau"), Email, Mật khẩu; nút Đăng nhập; dòng báo "Phiên đăng nhập đã hết hạn" hoặc "Doanh nghiệp đang tạm ngưng sử dụng" khi bị đưa về.</w:t>
             </w:r>
           </w:p>
         </w:tc>
@@ -1672,63 +2006,63 @@
         </w:trPr>
         <w:tc>
           <w:tcPr>
-            <w:tcW w:type="dxa" w:w="2409"/>
-            <w:tcBorders>
-              <w:top w:val="single" w:color="A6A6A6" w:sz="4"/>
-              <w:left w:val="single" w:color="A6A6A6" w:sz="4"/>
-              <w:bottom w:val="single" w:color="A6A6A6" w:sz="4"/>
-              <w:right w:val="single" w:color="A6A6A6" w:sz="4"/>
-            </w:tcBorders>
-            <w:tcMar>
-              <w:top w:type="dxa" w:w="60"/>
-              <w:left w:type="dxa" w:w="100"/>
-              <w:bottom w:type="dxa" w:w="60"/>
-              <w:right w:type="dxa" w:w="100"/>
-            </w:tcMar>
-            <w:vAlign w:val="top"/>
-          </w:tcPr>
-          <w:p>
-            <w:pPr>
-              <w:spacing w:after="20" w:line="270"/>
-            </w:pPr>
-            <w:r>
-              <w:rPr>
-                <w:rFonts w:ascii="Arial" w:cs="Arial" w:eastAsia="Arial" w:hAnsi="Arial"/>
-                <w:sz w:val="19"/>
-                <w:szCs w:val="19"/>
-              </w:rPr>
-              <w:t xml:space="preserve">Menu tài khoản</w:t>
-            </w:r>
-          </w:p>
-        </w:tc>
-        <w:tc>
-          <w:tcPr>
-            <w:tcW w:type="dxa" w:w="7229"/>
-            <w:tcBorders>
-              <w:top w:val="single" w:color="A6A6A6" w:sz="4"/>
-              <w:left w:val="single" w:color="A6A6A6" w:sz="4"/>
-              <w:bottom w:val="single" w:color="A6A6A6" w:sz="4"/>
-              <w:right w:val="single" w:color="A6A6A6" w:sz="4"/>
-            </w:tcBorders>
-            <w:tcMar>
-              <w:top w:type="dxa" w:w="60"/>
-              <w:left w:type="dxa" w:w="100"/>
-              <w:bottom w:type="dxa" w:w="60"/>
-              <w:right w:type="dxa" w:w="100"/>
-            </w:tcMar>
-            <w:vAlign w:val="top"/>
-          </w:tcPr>
-          <w:p>
-            <w:pPr>
-              <w:spacing w:after="20" w:line="270"/>
-            </w:pPr>
-            <w:r>
-              <w:rPr>
-                <w:rFonts w:ascii="Arial" w:cs="Arial" w:eastAsia="Arial" w:hAnsi="Arial"/>
-                <w:sz w:val="19"/>
-                <w:szCs w:val="19"/>
-              </w:rPr>
-              <w:t xml:space="preserve">Ở góc trên phải sau đăng nhập: tên, email, chức vụ; Giao diện (Sáng / Tối / Theo hệ thống); Mật độ hiển thị (Gọn / Vừa / Rộng); Đăng xuất. Hai lựa chọn giao diện và mật độ lưu theo trình duyệt.</w:t>
+            <w:tcW w:type="dxa" w:w="1430"/>
+            <w:tcBorders>
+              <w:top w:val="single" w:color="A6A6A6" w:sz="4"/>
+              <w:left w:val="single" w:color="A6A6A6" w:sz="4"/>
+              <w:bottom w:val="single" w:color="A6A6A6" w:sz="4"/>
+              <w:right w:val="single" w:color="A6A6A6" w:sz="4"/>
+            </w:tcBorders>
+            <w:tcMar>
+              <w:top w:type="dxa" w:w="60"/>
+              <w:left w:type="dxa" w:w="100"/>
+              <w:bottom w:type="dxa" w:w="60"/>
+              <w:right w:type="dxa" w:w="100"/>
+            </w:tcMar>
+            <w:vAlign w:val="top"/>
+          </w:tcPr>
+          <w:p>
+            <w:pPr>
+              <w:spacing w:after="20" w:line="270"/>
+            </w:pPr>
+            <w:r>
+              <w:rPr>
+                <w:rFonts w:ascii="Arial" w:cs="Arial" w:eastAsia="Arial" w:hAnsi="Arial"/>
+                <w:sz w:val="19"/>
+                <w:szCs w:val="19"/>
+              </w:rPr>
+              <w:t xml:space="preserve">Đổi mật khẩu</w:t>
+            </w:r>
+          </w:p>
+        </w:tc>
+        <w:tc>
+          <w:tcPr>
+            <w:tcW w:type="dxa" w:w="8208"/>
+            <w:tcBorders>
+              <w:top w:val="single" w:color="A6A6A6" w:sz="4"/>
+              <w:left w:val="single" w:color="A6A6A6" w:sz="4"/>
+              <w:bottom w:val="single" w:color="A6A6A6" w:sz="4"/>
+              <w:right w:val="single" w:color="A6A6A6" w:sz="4"/>
+            </w:tcBorders>
+            <w:tcMar>
+              <w:top w:type="dxa" w:w="60"/>
+              <w:left w:type="dxa" w:w="100"/>
+              <w:bottom w:type="dxa" w:w="60"/>
+              <w:right w:type="dxa" w:w="100"/>
+            </w:tcMar>
+            <w:vAlign w:val="top"/>
+          </w:tcPr>
+          <w:p>
+            <w:pPr>
+              <w:spacing w:after="20" w:line="270"/>
+            </w:pPr>
+            <w:r>
+              <w:rPr>
+                <w:rFonts w:ascii="Arial" w:cs="Arial" w:eastAsia="Arial" w:hAnsi="Arial"/>
+                <w:sz w:val="19"/>
+                <w:szCs w:val="19"/>
+              </w:rPr>
+              <w:t xml:space="preserve">Mật khẩu hiện tại, Mật khẩu mới (gợi ý "Từ 8 ký tự, có cả chữ và số"), Nhập lại; khi bị buộc đổi có dòng "Mật khẩu hiện tại do quản trị viên cấp…" và không có nút Quay lại; luôn có Đăng xuất.</w:t>
             </w:r>
           </w:p>
         </w:tc>
@@ -1739,63 +2073,63 @@
         </w:trPr>
         <w:tc>
           <w:tcPr>
-            <w:tcW w:type="dxa" w:w="2409"/>
-            <w:tcBorders>
-              <w:top w:val="single" w:color="A6A6A6" w:sz="4"/>
-              <w:left w:val="single" w:color="A6A6A6" w:sz="4"/>
-              <w:bottom w:val="single" w:color="A6A6A6" w:sz="4"/>
-              <w:right w:val="single" w:color="A6A6A6" w:sz="4"/>
-            </w:tcBorders>
-            <w:tcMar>
-              <w:top w:type="dxa" w:w="60"/>
-              <w:left w:type="dxa" w:w="100"/>
-              <w:bottom w:type="dxa" w:w="60"/>
-              <w:right w:type="dxa" w:w="100"/>
-            </w:tcMar>
-            <w:vAlign w:val="top"/>
-          </w:tcPr>
-          <w:p>
-            <w:pPr>
-              <w:spacing w:after="20" w:line="270"/>
-            </w:pPr>
-            <w:r>
-              <w:rPr>
-                <w:rFonts w:ascii="Arial" w:cs="Arial" w:eastAsia="Arial" w:hAnsi="Arial"/>
-                <w:sz w:val="19"/>
-                <w:szCs w:val="19"/>
-              </w:rPr>
-              <w:t xml:space="preserve">Khung layout</w:t>
-            </w:r>
-          </w:p>
-        </w:tc>
-        <w:tc>
-          <w:tcPr>
-            <w:tcW w:type="dxa" w:w="7229"/>
-            <w:tcBorders>
-              <w:top w:val="single" w:color="A6A6A6" w:sz="4"/>
-              <w:left w:val="single" w:color="A6A6A6" w:sz="4"/>
-              <w:bottom w:val="single" w:color="A6A6A6" w:sz="4"/>
-              <w:right w:val="single" w:color="A6A6A6" w:sz="4"/>
-            </w:tcBorders>
-            <w:tcMar>
-              <w:top w:type="dxa" w:w="60"/>
-              <w:left w:type="dxa" w:w="100"/>
-              <w:bottom w:type="dxa" w:w="60"/>
-              <w:right w:type="dxa" w:w="100"/>
-            </w:tcMar>
-            <w:vAlign w:val="top"/>
-          </w:tcPr>
-          <w:p>
-            <w:pPr>
-              <w:spacing w:after="20" w:line="270"/>
-            </w:pPr>
-            <w:r>
-              <w:rPr>
-                <w:rFonts w:ascii="Arial" w:cs="Arial" w:eastAsia="Arial" w:hAnsi="Arial"/>
-                <w:sz w:val="19"/>
-                <w:szCs w:val="19"/>
-              </w:rPr>
-              <w:t xml:space="preserve">Thanh menu trái chia nhóm: Nghiệp vụ, Mua hàng, Bán hàng, Dòng tiền, Thiết lập; bấm tên một nhóm để gập / mở các mục của nhóm (trạng thái được nhớ trong trình duyệt; vào một trang thuộc nhóm đang gập thì nhóm tự mở); có nút Thu gọn cả thanh về chỉ còn biểu tượng (khi đó mọi mục đều hiện). Menu chỉ hiện các mục chức vụ được phép mở. Góc trên thanh menu hiện logo công ty (ATL-20) và số phiên bản đang chạy (ví dụ v1.0.0) để biết đã lên bản mới chưa.</w:t>
+            <w:tcW w:type="dxa" w:w="1430"/>
+            <w:tcBorders>
+              <w:top w:val="single" w:color="A6A6A6" w:sz="4"/>
+              <w:left w:val="single" w:color="A6A6A6" w:sz="4"/>
+              <w:bottom w:val="single" w:color="A6A6A6" w:sz="4"/>
+              <w:right w:val="single" w:color="A6A6A6" w:sz="4"/>
+            </w:tcBorders>
+            <w:tcMar>
+              <w:top w:type="dxa" w:w="60"/>
+              <w:left w:type="dxa" w:w="100"/>
+              <w:bottom w:type="dxa" w:w="60"/>
+              <w:right w:type="dxa" w:w="100"/>
+            </w:tcMar>
+            <w:vAlign w:val="top"/>
+          </w:tcPr>
+          <w:p>
+            <w:pPr>
+              <w:spacing w:after="20" w:line="270"/>
+            </w:pPr>
+            <w:r>
+              <w:rPr>
+                <w:rFonts w:ascii="Arial" w:cs="Arial" w:eastAsia="Arial" w:hAnsi="Arial"/>
+                <w:sz w:val="19"/>
+                <w:szCs w:val="19"/>
+              </w:rPr>
+              <w:t xml:space="preserve">Menu tài khoản</w:t>
+            </w:r>
+          </w:p>
+        </w:tc>
+        <w:tc>
+          <w:tcPr>
+            <w:tcW w:type="dxa" w:w="8208"/>
+            <w:tcBorders>
+              <w:top w:val="single" w:color="A6A6A6" w:sz="4"/>
+              <w:left w:val="single" w:color="A6A6A6" w:sz="4"/>
+              <w:bottom w:val="single" w:color="A6A6A6" w:sz="4"/>
+              <w:right w:val="single" w:color="A6A6A6" w:sz="4"/>
+            </w:tcBorders>
+            <w:tcMar>
+              <w:top w:type="dxa" w:w="60"/>
+              <w:left w:type="dxa" w:w="100"/>
+              <w:bottom w:type="dxa" w:w="60"/>
+              <w:right w:type="dxa" w:w="100"/>
+            </w:tcMar>
+            <w:vAlign w:val="top"/>
+          </w:tcPr>
+          <w:p>
+            <w:pPr>
+              <w:spacing w:after="20" w:line="270"/>
+            </w:pPr>
+            <w:r>
+              <w:rPr>
+                <w:rFonts w:ascii="Arial" w:cs="Arial" w:eastAsia="Arial" w:hAnsi="Arial"/>
+                <w:sz w:val="19"/>
+                <w:szCs w:val="19"/>
+              </w:rPr>
+              <w:t xml:space="preserve">Góc trên phải: tên, email, chức vụ; Giao diện (Sáng / Tối / Theo hệ thống) và Mật độ hiển thị (Gọn / Vừa / Rộng) là hai hàng ô chọn; Đổi mật khẩu; Đăng xuất. Hai lựa chọn giao diện và mật độ lưu theo trình duyệt.</w:t>
             </w:r>
           </w:p>
         </w:tc>
@@ -1806,7 +2140,74 @@
         </w:trPr>
         <w:tc>
           <w:tcPr>
-            <w:tcW w:type="dxa" w:w="2409"/>
+            <w:tcW w:type="dxa" w:w="1430"/>
+            <w:tcBorders>
+              <w:top w:val="single" w:color="A6A6A6" w:sz="4"/>
+              <w:left w:val="single" w:color="A6A6A6" w:sz="4"/>
+              <w:bottom w:val="single" w:color="A6A6A6" w:sz="4"/>
+              <w:right w:val="single" w:color="A6A6A6" w:sz="4"/>
+            </w:tcBorders>
+            <w:tcMar>
+              <w:top w:type="dxa" w:w="60"/>
+              <w:left w:type="dxa" w:w="100"/>
+              <w:bottom w:type="dxa" w:w="60"/>
+              <w:right w:type="dxa" w:w="100"/>
+            </w:tcMar>
+            <w:vAlign w:val="top"/>
+          </w:tcPr>
+          <w:p>
+            <w:pPr>
+              <w:spacing w:after="20" w:line="270"/>
+            </w:pPr>
+            <w:r>
+              <w:rPr>
+                <w:rFonts w:ascii="Arial" w:cs="Arial" w:eastAsia="Arial" w:hAnsi="Arial"/>
+                <w:sz w:val="19"/>
+                <w:szCs w:val="19"/>
+              </w:rPr>
+              <w:t xml:space="preserve">Khung layout</w:t>
+            </w:r>
+          </w:p>
+        </w:tc>
+        <w:tc>
+          <w:tcPr>
+            <w:tcW w:type="dxa" w:w="8208"/>
+            <w:tcBorders>
+              <w:top w:val="single" w:color="A6A6A6" w:sz="4"/>
+              <w:left w:val="single" w:color="A6A6A6" w:sz="4"/>
+              <w:bottom w:val="single" w:color="A6A6A6" w:sz="4"/>
+              <w:right w:val="single" w:color="A6A6A6" w:sz="4"/>
+            </w:tcBorders>
+            <w:tcMar>
+              <w:top w:type="dxa" w:w="60"/>
+              <w:left w:type="dxa" w:w="100"/>
+              <w:bottom w:type="dxa" w:w="60"/>
+              <w:right w:type="dxa" w:w="100"/>
+            </w:tcMar>
+            <w:vAlign w:val="top"/>
+          </w:tcPr>
+          <w:p>
+            <w:pPr>
+              <w:spacing w:after="20" w:line="270"/>
+            </w:pPr>
+            <w:r>
+              <w:rPr>
+                <w:rFonts w:ascii="Arial" w:cs="Arial" w:eastAsia="Arial" w:hAnsi="Arial"/>
+                <w:sz w:val="19"/>
+                <w:szCs w:val="19"/>
+              </w:rPr>
+              <w:t xml:space="preserve">Thanh menu trái chia nhóm, mỗi nhóm một màu phân hệ: Nghiệp vụ (cam), Mua hàng (tím), Bán hàng (xanh dương), Dòng tiền (xanh ngọc), Thiết lập (xám xanh); bấm tên nhóm để gập / mở (được nhớ). Nút Thu gọn còn biểu tượng. Menu chỉ hiện mục chức vụ được mở. Góc trên hiện logo công ty và số phiên bản (ví dụ v1.0.0). Thanh tải mảnh ở thanh trên khi chuyển trang quá 120 ms.</w:t>
+            </w:r>
+          </w:p>
+        </w:tc>
+      </w:tr>
+      <w:tr>
+        <w:trPr>
+          <w:cantSplit/>
+        </w:trPr>
+        <w:tc>
+          <w:tcPr>
+            <w:tcW w:type="dxa" w:w="1430"/>
             <w:tcBorders>
               <w:top w:val="single" w:color="A6A6A6" w:sz="4"/>
               <w:left w:val="single" w:color="A6A6A6" w:sz="4"/>
@@ -1837,37 +2238,42 @@
         </w:tc>
         <w:tc>
           <w:tcPr>
-            <w:tcW w:type="dxa" w:w="7229"/>
-            <w:tcBorders>
-              <w:top w:val="single" w:color="A6A6A6" w:sz="4"/>
-              <w:left w:val="single" w:color="A6A6A6" w:sz="4"/>
-              <w:bottom w:val="single" w:color="A6A6A6" w:sz="4"/>
-              <w:right w:val="single" w:color="A6A6A6" w:sz="4"/>
-            </w:tcBorders>
-            <w:tcMar>
-              <w:top w:type="dxa" w:w="60"/>
-              <w:left w:type="dxa" w:w="100"/>
-              <w:bottom w:type="dxa" w:w="60"/>
-              <w:right w:type="dxa" w:w="100"/>
-            </w:tcMar>
-            <w:vAlign w:val="top"/>
-          </w:tcPr>
-          <w:p>
-            <w:pPr>
-              <w:spacing w:after="20" w:line="270"/>
-            </w:pPr>
-            <w:r>
-              <w:rPr>
-                <w:rFonts w:ascii="Arial" w:cs="Arial" w:eastAsia="Arial" w:hAnsi="Arial"/>
-                <w:sz w:val="19"/>
-                <w:szCs w:val="19"/>
-              </w:rPr>
-              <w:t xml:space="preserve">Ô ở thanh trên (phím tắt Ctrl K, hoặc "/" khi không gõ trong ô nhập): tìm đơn, khách, hàng, phiếu…, hoặc mở nhanh form tạo chứng từ mới.</w:t>
+            <w:tcW w:type="dxa" w:w="8208"/>
+            <w:tcBorders>
+              <w:top w:val="single" w:color="A6A6A6" w:sz="4"/>
+              <w:left w:val="single" w:color="A6A6A6" w:sz="4"/>
+              <w:bottom w:val="single" w:color="A6A6A6" w:sz="4"/>
+              <w:right w:val="single" w:color="A6A6A6" w:sz="4"/>
+            </w:tcBorders>
+            <w:tcMar>
+              <w:top w:type="dxa" w:w="60"/>
+              <w:left w:type="dxa" w:w="100"/>
+              <w:bottom w:type="dxa" w:w="60"/>
+              <w:right w:type="dxa" w:w="100"/>
+            </w:tcMar>
+            <w:vAlign w:val="top"/>
+          </w:tcPr>
+          <w:p>
+            <w:pPr>
+              <w:spacing w:after="20" w:line="270"/>
+            </w:pPr>
+            <w:r>
+              <w:rPr>
+                <w:rFonts w:ascii="Arial" w:cs="Arial" w:eastAsia="Arial" w:hAnsi="Arial"/>
+                <w:sz w:val="19"/>
+                <w:szCs w:val="19"/>
+              </w:rPr>
+              <w:t xml:space="preserve">Ô ở thanh trên (Ctrl K, hoặc "/"): xem ATL-25.</w:t>
             </w:r>
           </w:p>
         </w:tc>
       </w:tr>
     </w:tbl>
+    <w:p>
+      <w:pPr>
+        <w:spacing w:after="60"/>
+      </w:pPr>
+    </w:p>
     <w:p>
       <w:pPr>
         <w:pStyle w:val="Heading1"/>
@@ -1891,7 +2297,7 @@
         <w:pStyle w:val="ListParagraph"/>
         <w:numPr>
           <w:ilvl w:val="0"/>
-          <w:numId w:val="3"/>
+          <w:numId w:val="2"/>
         </w:numPr>
         <w:spacing w:after="70" w:line="290"/>
       </w:pPr>
@@ -1901,7 +2307,7 @@
           <w:sz w:val="21"/>
           <w:szCs w:val="21"/>
         </w:rPr>
-        <w:t xml:space="preserve">Đăng nhập thành công, máy chủ cấp một mã phiên có hạn </w:t>
+        <w:t xml:space="preserve">Đăng nhập thành công, máy chủ cấp mã phiên có hạn </w:t>
       </w:r>
       <w:r>
         <w:rPr>
@@ -1919,7 +2325,7 @@
           <w:sz w:val="21"/>
           <w:szCs w:val="21"/>
         </w:rPr>
-        <w:t xml:space="preserve">; mã được giữ trong trình duyệt và khôi phục khi tải lại trang; Đăng xuất xoá phiên. Phiên hết hạn hoặc bị thu hồi thì thao tác kế tiếp đưa về /login, đăng nhập lại sẽ quay về đúng trang đang mở.</w:t>
+        <w:t xml:space="preserve">, giữ trong trình duyệt và khôi phục khi tải lại trang. Phiên hết hạn hoặc bị thu hồi thì thao tác kế tiếp đưa về /login; đăng nhập lại quay về đúng trang đang mở.</w:t>
       </w:r>
     </w:p>
     <w:p>
@@ -1927,7 +2333,7 @@
         <w:pStyle w:val="ListParagraph"/>
         <w:numPr>
           <w:ilvl w:val="0"/>
-          <w:numId w:val="3"/>
+          <w:numId w:val="2"/>
         </w:numPr>
         <w:spacing w:after="70" w:line="290"/>
       </w:pPr>
@@ -1937,7 +2343,43 @@
           <w:sz w:val="21"/>
           <w:szCs w:val="21"/>
         </w:rPr>
-        <w:t xml:space="preserve">Mọi màn hình trừ /login đều có chốt kiểm tra đăng nhập: chưa đăng nhập thì chuyển về /login.</w:t>
+        <w:t xml:space="preserve">Máy chủ đối chiếu email (không phân biệt hoa thường) và mật khẩu. </w:t>
+      </w:r>
+      <w:r>
+        <w:rPr>
+          <w:rFonts w:ascii="Arial" w:cs="Arial" w:eastAsia="Arial" w:hAnsi="Arial"/>
+          <w:b/>
+          <w:bCs/>
+          <w:sz w:val="21"/>
+          <w:szCs w:val="21"/>
+        </w:rPr>
+        <w:t xml:space="preserve">Tài khoản bị khoá</w:t>
+      </w:r>
+      <w:r>
+        <w:rPr>
+          <w:rFonts w:ascii="Arial" w:cs="Arial" w:eastAsia="Arial" w:hAnsi="Arial"/>
+          <w:sz w:val="21"/>
+          <w:szCs w:val="21"/>
+        </w:rPr>
+        <w:t xml:space="preserve"> hoặc </w:t>
+      </w:r>
+      <w:r>
+        <w:rPr>
+          <w:rFonts w:ascii="Arial" w:cs="Arial" w:eastAsia="Arial" w:hAnsi="Arial"/>
+          <w:b/>
+          <w:bCs/>
+          <w:sz w:val="21"/>
+          <w:szCs w:val="21"/>
+        </w:rPr>
+        <w:t xml:space="preserve">chức vụ đã ngừng dùng</w:t>
+      </w:r>
+      <w:r>
+        <w:rPr>
+          <w:rFonts w:ascii="Arial" w:cs="Arial" w:eastAsia="Arial" w:hAnsi="Arial"/>
+          <w:sz w:val="21"/>
+          <w:szCs w:val="21"/>
+        </w:rPr>
+        <w:t xml:space="preserve"> không đăng nhập được; mã phiên đang dùng của họ bị từ chối ở mọi API.</w:t>
       </w:r>
     </w:p>
     <w:p>
@@ -1945,17 +2387,27 @@
         <w:pStyle w:val="ListParagraph"/>
         <w:numPr>
           <w:ilvl w:val="0"/>
-          <w:numId w:val="3"/>
+          <w:numId w:val="2"/>
         </w:numPr>
         <w:spacing w:after="70" w:line="290"/>
       </w:pPr>
       <w:r>
         <w:rPr>
           <w:rFonts w:ascii="Arial" w:cs="Arial" w:eastAsia="Arial" w:hAnsi="Arial"/>
+          <w:b/>
+          <w:bCs/>
           <w:sz w:val="21"/>
           <w:szCs w:val="21"/>
         </w:rPr>
-        <w:t xml:space="preserve">Máy chủ đối chiếu email (không phân biệt hoa thường) và mật khẩu với danh sách Người dùng; tài khoản bị khoá không vào được; chức vụ đã ngừng dùng thì vào được nhưng không có quyền nào.</w:t>
+        <w:t xml:space="preserve">Giới hạn thử mật khẩu:</w:t>
+      </w:r>
+      <w:r>
+        <w:rPr>
+          <w:rFonts w:ascii="Arial" w:cs="Arial" w:eastAsia="Arial" w:hAnsi="Arial"/>
+          <w:sz w:val="21"/>
+          <w:szCs w:val="21"/>
+        </w:rPr>
+        <w:t xml:space="preserve"> mặc định 8 lần / 15 phút cho mỗi email trên một địa chỉ IP và 30 lần / 5 phút cho mỗi IP; vượt thì báo "Thử đăng nhập quá nhiều lần. Vui lòng đợi vài phút rồi thử lại."</w:t>
       </w:r>
     </w:p>
     <w:p>
@@ -1963,17 +2415,27 @@
         <w:pStyle w:val="ListParagraph"/>
         <w:numPr>
           <w:ilvl w:val="0"/>
-          <w:numId w:val="3"/>
+          <w:numId w:val="2"/>
         </w:numPr>
         <w:spacing w:after="70" w:line="290"/>
       </w:pPr>
       <w:r>
         <w:rPr>
           <w:rFonts w:ascii="Arial" w:cs="Arial" w:eastAsia="Arial" w:hAnsi="Arial"/>
+          <w:b/>
+          <w:bCs/>
           <w:sz w:val="21"/>
           <w:szCs w:val="21"/>
         </w:rPr>
-        <w:t xml:space="preserve">Khoá tài khoản, đặt lại mật khẩu hoặc "Đăng xuất mọi phiên" ở ATL-22 thu hồi ngay các phiên đang mở; đổi quyền của chức vụ có hiệu lực từ yêu cầu kế tiếp — không phải chờ phiên hết hạn.</w:t>
+        <w:t xml:space="preserve">Buộc đổi mật khẩu:</w:t>
+      </w:r>
+      <w:r>
+        <w:rPr>
+          <w:rFonts w:ascii="Arial" w:cs="Arial" w:eastAsia="Arial" w:hAnsi="Arial"/>
+          <w:sz w:val="21"/>
+          <w:szCs w:val="21"/>
+        </w:rPr>
+        <w:t xml:space="preserve"> tài khoản do quản trị tạo hoặc đặt lại mật khẩu (ATL-22) phải đổi ở lần đăng nhập đầu; đến khi đổi, máy chủ chỉ cho xem phiên và đổi mật khẩu.</w:t>
       </w:r>
     </w:p>
     <w:p>
@@ -1981,7 +2443,7 @@
         <w:pStyle w:val="ListParagraph"/>
         <w:numPr>
           <w:ilvl w:val="0"/>
-          <w:numId w:val="3"/>
+          <w:numId w:val="2"/>
         </w:numPr>
         <w:spacing w:after="70" w:line="290"/>
       </w:pPr>
@@ -1991,7 +2453,7 @@
           <w:sz w:val="21"/>
           <w:szCs w:val="21"/>
         </w:rPr>
-        <w:t xml:space="preserve">Mỗi lần đăng nhập — thành công hay thất bại — được ghi vào Nhật ký hoạt động kèm địa chỉ IP (ATL-27).</w:t>
+        <w:t xml:space="preserve">Mật khẩu mới: từ 8 ký tự, có cả chữ và số, khác mật khẩu hiện tại.</w:t>
       </w:r>
     </w:p>
     <w:p>
@@ -1999,7 +2461,7 @@
         <w:pStyle w:val="ListParagraph"/>
         <w:numPr>
           <w:ilvl w:val="0"/>
-          <w:numId w:val="3"/>
+          <w:numId w:val="2"/>
         </w:numPr>
         <w:spacing w:after="70" w:line="290"/>
       </w:pPr>
@@ -2009,7 +2471,53 @@
           <w:sz w:val="21"/>
           <w:szCs w:val="21"/>
         </w:rPr>
-        <w:t xml:space="preserve">Quy tắc mật khẩu (từ 8 ký tự, có cả chữ và số) áp dụng khi tạo hoặc đặt lại mật khẩu ở ATL-22.</w:t>
+        <w:t xml:space="preserve">Khoá tài khoản, đặt lại mật khẩu, "Đăng xuất mọi phiên" (ATL-22) hoặc ngừng dùng chức vụ (ATL-23) thu hồi ngay các phiên; đổi quyền của chức vụ có hiệu lực từ yêu cầu kế tiếp.</w:t>
+      </w:r>
+    </w:p>
+    <w:p>
+      <w:pPr>
+        <w:pStyle w:val="ListParagraph"/>
+        <w:numPr>
+          <w:ilvl w:val="0"/>
+          <w:numId w:val="2"/>
+        </w:numPr>
+        <w:spacing w:after="70" w:line="290"/>
+      </w:pPr>
+      <w:r>
+        <w:rPr>
+          <w:rFonts w:ascii="Arial" w:cs="Arial" w:eastAsia="Arial" w:hAnsi="Arial"/>
+          <w:b/>
+          <w:bCs/>
+          <w:sz w:val="21"/>
+          <w:szCs w:val="21"/>
+        </w:rPr>
+        <w:t xml:space="preserve">Nhiều doanh nghiệp:</w:t>
+      </w:r>
+      <w:r>
+        <w:rPr>
+          <w:rFonts w:ascii="Arial" w:cs="Arial" w:eastAsia="Arial" w:hAnsi="Arial"/>
+          <w:sz w:val="21"/>
+          <w:szCs w:val="21"/>
+        </w:rPr>
+        <w:t xml:space="preserve"> mã phiên mang mã doanh nghiệp và chỉ dùng được cho doanh nghiệp đó; doanh nghiệp bị tạm ngưng thì mọi đăng nhập và thao tác bị chặn ngay.</w:t>
+      </w:r>
+    </w:p>
+    <w:p>
+      <w:pPr>
+        <w:pStyle w:val="ListParagraph"/>
+        <w:numPr>
+          <w:ilvl w:val="0"/>
+          <w:numId w:val="2"/>
+        </w:numPr>
+        <w:spacing w:after="70" w:line="290"/>
+      </w:pPr>
+      <w:r>
+        <w:rPr>
+          <w:rFonts w:ascii="Arial" w:cs="Arial" w:eastAsia="Arial" w:hAnsi="Arial"/>
+          <w:sz w:val="21"/>
+          <w:szCs w:val="21"/>
+        </w:rPr>
+        <w:t xml:space="preserve">Mỗi lần đăng nhập — thành công hay thất bại — được ghi vào Nhật ký hoạt động kèm địa chỉ IP (ATL-27).</w:t>
       </w:r>
     </w:p>
     <w:p>
@@ -2043,8 +2551,8 @@
         </w:tblBorders>
       </w:tblPr>
       <w:tblGrid>
-        <w:gridCol w:w="3614"/>
-        <w:gridCol w:w="6024"/>
+        <w:gridCol w:w="3004"/>
+        <w:gridCol w:w="6634"/>
       </w:tblGrid>
       <w:tr>
         <w:trPr>
@@ -2053,7 +2561,7 @@
         </w:trPr>
         <w:tc>
           <w:tcPr>
-            <w:tcW w:type="dxa" w:w="3614"/>
+            <w:tcW w:type="dxa" w:w="3004"/>
             <w:tcBorders>
               <w:top w:val="single" w:color="A6A6A6" w:sz="4"/>
               <w:left w:val="single" w:color="A6A6A6" w:sz="4"/>
@@ -2087,7 +2595,7 @@
         </w:tc>
         <w:tc>
           <w:tcPr>
-            <w:tcW w:type="dxa" w:w="6024"/>
+            <w:tcW w:type="dxa" w:w="6634"/>
             <w:tcBorders>
               <w:top w:val="single" w:color="A6A6A6" w:sz="4"/>
               <w:left w:val="single" w:color="A6A6A6" w:sz="4"/>
@@ -2126,7 +2634,7 @@
         </w:trPr>
         <w:tc>
           <w:tcPr>
-            <w:tcW w:type="dxa" w:w="3614"/>
+            <w:tcW w:type="dxa" w:w="3004"/>
             <w:tcBorders>
               <w:top w:val="single" w:color="A6A6A6" w:sz="4"/>
               <w:left w:val="single" w:color="A6A6A6" w:sz="4"/>
@@ -2157,32 +2665,32 @@
         </w:tc>
         <w:tc>
           <w:tcPr>
-            <w:tcW w:type="dxa" w:w="6024"/>
-            <w:tcBorders>
-              <w:top w:val="single" w:color="A6A6A6" w:sz="4"/>
-              <w:left w:val="single" w:color="A6A6A6" w:sz="4"/>
-              <w:bottom w:val="single" w:color="A6A6A6" w:sz="4"/>
-              <w:right w:val="single" w:color="A6A6A6" w:sz="4"/>
-            </w:tcBorders>
-            <w:tcMar>
-              <w:top w:type="dxa" w:w="60"/>
-              <w:left w:type="dxa" w:w="100"/>
-              <w:bottom w:type="dxa" w:w="60"/>
-              <w:right w:type="dxa" w:w="100"/>
-            </w:tcMar>
-            <w:vAlign w:val="top"/>
-          </w:tcPr>
-          <w:p>
-            <w:pPr>
-              <w:spacing w:after="20" w:line="270"/>
-            </w:pPr>
-            <w:r>
-              <w:rPr>
-                <w:rFonts w:ascii="Arial" w:cs="Arial" w:eastAsia="Arial" w:hAnsi="Arial"/>
-                <w:sz w:val="19"/>
-                <w:szCs w:val="19"/>
-              </w:rPr>
-              <w:t xml:space="preserve">Hiện "Sai email hoặc mật khẩu", không vào hệ thống. Tài khoản bị khoá nhận cùng thông báo để không lộ email nào có trong hệ thống; lý do thật ghi ở Nhật ký.</w:t>
+            <w:tcW w:type="dxa" w:w="6634"/>
+            <w:tcBorders>
+              <w:top w:val="single" w:color="A6A6A6" w:sz="4"/>
+              <w:left w:val="single" w:color="A6A6A6" w:sz="4"/>
+              <w:bottom w:val="single" w:color="A6A6A6" w:sz="4"/>
+              <w:right w:val="single" w:color="A6A6A6" w:sz="4"/>
+            </w:tcBorders>
+            <w:tcMar>
+              <w:top w:type="dxa" w:w="60"/>
+              <w:left w:type="dxa" w:w="100"/>
+              <w:bottom w:type="dxa" w:w="60"/>
+              <w:right w:type="dxa" w:w="100"/>
+            </w:tcMar>
+            <w:vAlign w:val="top"/>
+          </w:tcPr>
+          <w:p>
+            <w:pPr>
+              <w:spacing w:after="20" w:line="270"/>
+            </w:pPr>
+            <w:r>
+              <w:rPr>
+                <w:rFonts w:ascii="Arial" w:cs="Arial" w:eastAsia="Arial" w:hAnsi="Arial"/>
+                <w:sz w:val="19"/>
+                <w:szCs w:val="19"/>
+              </w:rPr>
+              <w:t xml:space="preserve">"Sai email hoặc mật khẩu". Tài khoản bị khoá nhận cùng thông báo để không lộ email nào có trong hệ thống; lý do thật ghi ở Nhật ký.</w:t>
             </w:r>
           </w:p>
         </w:tc>
@@ -2193,63 +2701,63 @@
         </w:trPr>
         <w:tc>
           <w:tcPr>
-            <w:tcW w:type="dxa" w:w="3614"/>
-            <w:tcBorders>
-              <w:top w:val="single" w:color="A6A6A6" w:sz="4"/>
-              <w:left w:val="single" w:color="A6A6A6" w:sz="4"/>
-              <w:bottom w:val="single" w:color="A6A6A6" w:sz="4"/>
-              <w:right w:val="single" w:color="A6A6A6" w:sz="4"/>
-            </w:tcBorders>
-            <w:tcMar>
-              <w:top w:type="dxa" w:w="60"/>
-              <w:left w:type="dxa" w:w="100"/>
-              <w:bottom w:type="dxa" w:w="60"/>
-              <w:right w:type="dxa" w:w="100"/>
-            </w:tcMar>
-            <w:vAlign w:val="top"/>
-          </w:tcPr>
-          <w:p>
-            <w:pPr>
-              <w:spacing w:after="20" w:line="270"/>
-            </w:pPr>
-            <w:r>
-              <w:rPr>
-                <w:rFonts w:ascii="Arial" w:cs="Arial" w:eastAsia="Arial" w:hAnsi="Arial"/>
-                <w:sz w:val="19"/>
-                <w:szCs w:val="19"/>
-              </w:rPr>
-              <w:t xml:space="preserve">Phiên hết hạn hoặc bị thu hồi</w:t>
-            </w:r>
-          </w:p>
-        </w:tc>
-        <w:tc>
-          <w:tcPr>
-            <w:tcW w:type="dxa" w:w="6024"/>
-            <w:tcBorders>
-              <w:top w:val="single" w:color="A6A6A6" w:sz="4"/>
-              <w:left w:val="single" w:color="A6A6A6" w:sz="4"/>
-              <w:bottom w:val="single" w:color="A6A6A6" w:sz="4"/>
-              <w:right w:val="single" w:color="A6A6A6" w:sz="4"/>
-            </w:tcBorders>
-            <w:tcMar>
-              <w:top w:type="dxa" w:w="60"/>
-              <w:left w:type="dxa" w:w="100"/>
-              <w:bottom w:type="dxa" w:w="60"/>
-              <w:right w:type="dxa" w:w="100"/>
-            </w:tcMar>
-            <w:vAlign w:val="top"/>
-          </w:tcPr>
-          <w:p>
-            <w:pPr>
-              <w:spacing w:after="20" w:line="270"/>
-            </w:pPr>
-            <w:r>
-              <w:rPr>
-                <w:rFonts w:ascii="Arial" w:cs="Arial" w:eastAsia="Arial" w:hAnsi="Arial"/>
-                <w:sz w:val="19"/>
-                <w:szCs w:val="19"/>
-              </w:rPr>
-              <w:t xml:space="preserve">Đưa về /login; đăng nhập lại thì quay về trang đang mở.</w:t>
+            <w:tcW w:type="dxa" w:w="3004"/>
+            <w:tcBorders>
+              <w:top w:val="single" w:color="A6A6A6" w:sz="4"/>
+              <w:left w:val="single" w:color="A6A6A6" w:sz="4"/>
+              <w:bottom w:val="single" w:color="A6A6A6" w:sz="4"/>
+              <w:right w:val="single" w:color="A6A6A6" w:sz="4"/>
+            </w:tcBorders>
+            <w:tcMar>
+              <w:top w:type="dxa" w:w="60"/>
+              <w:left w:type="dxa" w:w="100"/>
+              <w:bottom w:type="dxa" w:w="60"/>
+              <w:right w:type="dxa" w:w="100"/>
+            </w:tcMar>
+            <w:vAlign w:val="top"/>
+          </w:tcPr>
+          <w:p>
+            <w:pPr>
+              <w:spacing w:after="20" w:line="270"/>
+            </w:pPr>
+            <w:r>
+              <w:rPr>
+                <w:rFonts w:ascii="Arial" w:cs="Arial" w:eastAsia="Arial" w:hAnsi="Arial"/>
+                <w:sz w:val="19"/>
+                <w:szCs w:val="19"/>
+              </w:rPr>
+              <w:t xml:space="preserve">Thử sai quá nhiều lần</w:t>
+            </w:r>
+          </w:p>
+        </w:tc>
+        <w:tc>
+          <w:tcPr>
+            <w:tcW w:type="dxa" w:w="6634"/>
+            <w:tcBorders>
+              <w:top w:val="single" w:color="A6A6A6" w:sz="4"/>
+              <w:left w:val="single" w:color="A6A6A6" w:sz="4"/>
+              <w:bottom w:val="single" w:color="A6A6A6" w:sz="4"/>
+              <w:right w:val="single" w:color="A6A6A6" w:sz="4"/>
+            </w:tcBorders>
+            <w:tcMar>
+              <w:top w:type="dxa" w:w="60"/>
+              <w:left w:type="dxa" w:w="100"/>
+              <w:bottom w:type="dxa" w:w="60"/>
+              <w:right w:type="dxa" w:w="100"/>
+            </w:tcMar>
+            <w:vAlign w:val="top"/>
+          </w:tcPr>
+          <w:p>
+            <w:pPr>
+              <w:spacing w:after="20" w:line="270"/>
+            </w:pPr>
+            <w:r>
+              <w:rPr>
+                <w:rFonts w:ascii="Arial" w:cs="Arial" w:eastAsia="Arial" w:hAnsi="Arial"/>
+                <w:sz w:val="19"/>
+                <w:szCs w:val="19"/>
+              </w:rPr>
+              <w:t xml:space="preserve">Chặn tạm, báo đợi vài phút.</w:t>
             </w:r>
           </w:p>
         </w:tc>
@@ -2260,7 +2768,208 @@
         </w:trPr>
         <w:tc>
           <w:tcPr>
-            <w:tcW w:type="dxa" w:w="3614"/>
+            <w:tcW w:type="dxa" w:w="3004"/>
+            <w:tcBorders>
+              <w:top w:val="single" w:color="A6A6A6" w:sz="4"/>
+              <w:left w:val="single" w:color="A6A6A6" w:sz="4"/>
+              <w:bottom w:val="single" w:color="A6A6A6" w:sz="4"/>
+              <w:right w:val="single" w:color="A6A6A6" w:sz="4"/>
+            </w:tcBorders>
+            <w:tcMar>
+              <w:top w:type="dxa" w:w="60"/>
+              <w:left w:type="dxa" w:w="100"/>
+              <w:bottom w:type="dxa" w:w="60"/>
+              <w:right w:type="dxa" w:w="100"/>
+            </w:tcMar>
+            <w:vAlign w:val="top"/>
+          </w:tcPr>
+          <w:p>
+            <w:pPr>
+              <w:spacing w:after="20" w:line="270"/>
+            </w:pPr>
+            <w:r>
+              <w:rPr>
+                <w:rFonts w:ascii="Arial" w:cs="Arial" w:eastAsia="Arial" w:hAnsi="Arial"/>
+                <w:sz w:val="19"/>
+                <w:szCs w:val="19"/>
+              </w:rPr>
+              <w:t xml:space="preserve">Phiên hết hạn hoặc bị thu hồi</w:t>
+            </w:r>
+          </w:p>
+        </w:tc>
+        <w:tc>
+          <w:tcPr>
+            <w:tcW w:type="dxa" w:w="6634"/>
+            <w:tcBorders>
+              <w:top w:val="single" w:color="A6A6A6" w:sz="4"/>
+              <w:left w:val="single" w:color="A6A6A6" w:sz="4"/>
+              <w:bottom w:val="single" w:color="A6A6A6" w:sz="4"/>
+              <w:right w:val="single" w:color="A6A6A6" w:sz="4"/>
+            </w:tcBorders>
+            <w:tcMar>
+              <w:top w:type="dxa" w:w="60"/>
+              <w:left w:type="dxa" w:w="100"/>
+              <w:bottom w:type="dxa" w:w="60"/>
+              <w:right w:type="dxa" w:w="100"/>
+            </w:tcMar>
+            <w:vAlign w:val="top"/>
+          </w:tcPr>
+          <w:p>
+            <w:pPr>
+              <w:spacing w:after="20" w:line="270"/>
+            </w:pPr>
+            <w:r>
+              <w:rPr>
+                <w:rFonts w:ascii="Arial" w:cs="Arial" w:eastAsia="Arial" w:hAnsi="Arial"/>
+                <w:sz w:val="19"/>
+                <w:szCs w:val="19"/>
+              </w:rPr>
+              <w:t xml:space="preserve">Đưa về /login kèm dòng "Phiên đăng nhập đã hết hạn"; đăng nhập lại thì quay về trang đang mở.</w:t>
+            </w:r>
+          </w:p>
+        </w:tc>
+      </w:tr>
+      <w:tr>
+        <w:trPr>
+          <w:cantSplit/>
+        </w:trPr>
+        <w:tc>
+          <w:tcPr>
+            <w:tcW w:type="dxa" w:w="3004"/>
+            <w:tcBorders>
+              <w:top w:val="single" w:color="A6A6A6" w:sz="4"/>
+              <w:left w:val="single" w:color="A6A6A6" w:sz="4"/>
+              <w:bottom w:val="single" w:color="A6A6A6" w:sz="4"/>
+              <w:right w:val="single" w:color="A6A6A6" w:sz="4"/>
+            </w:tcBorders>
+            <w:tcMar>
+              <w:top w:type="dxa" w:w="60"/>
+              <w:left w:type="dxa" w:w="100"/>
+              <w:bottom w:type="dxa" w:w="60"/>
+              <w:right w:type="dxa" w:w="100"/>
+            </w:tcMar>
+            <w:vAlign w:val="top"/>
+          </w:tcPr>
+          <w:p>
+            <w:pPr>
+              <w:spacing w:after="20" w:line="270"/>
+            </w:pPr>
+            <w:r>
+              <w:rPr>
+                <w:rFonts w:ascii="Arial" w:cs="Arial" w:eastAsia="Arial" w:hAnsi="Arial"/>
+                <w:sz w:val="19"/>
+                <w:szCs w:val="19"/>
+              </w:rPr>
+              <w:t xml:space="preserve">Doanh nghiệp bị tạm ngưng</w:t>
+            </w:r>
+          </w:p>
+        </w:tc>
+        <w:tc>
+          <w:tcPr>
+            <w:tcW w:type="dxa" w:w="6634"/>
+            <w:tcBorders>
+              <w:top w:val="single" w:color="A6A6A6" w:sz="4"/>
+              <w:left w:val="single" w:color="A6A6A6" w:sz="4"/>
+              <w:bottom w:val="single" w:color="A6A6A6" w:sz="4"/>
+              <w:right w:val="single" w:color="A6A6A6" w:sz="4"/>
+            </w:tcBorders>
+            <w:tcMar>
+              <w:top w:type="dxa" w:w="60"/>
+              <w:left w:type="dxa" w:w="100"/>
+              <w:bottom w:type="dxa" w:w="60"/>
+              <w:right w:type="dxa" w:w="100"/>
+            </w:tcMar>
+            <w:vAlign w:val="top"/>
+          </w:tcPr>
+          <w:p>
+            <w:pPr>
+              <w:spacing w:after="20" w:line="270"/>
+            </w:pPr>
+            <w:r>
+              <w:rPr>
+                <w:rFonts w:ascii="Arial" w:cs="Arial" w:eastAsia="Arial" w:hAnsi="Arial"/>
+                <w:sz w:val="19"/>
+                <w:szCs w:val="19"/>
+              </w:rPr>
+              <w:t xml:space="preserve">Đưa về /login kèm "Doanh nghiệp đang tạm ngưng sử dụng. Vui lòng liên hệ đơn vị cung cấp phần mềm."</w:t>
+            </w:r>
+          </w:p>
+        </w:tc>
+      </w:tr>
+      <w:tr>
+        <w:trPr>
+          <w:cantSplit/>
+        </w:trPr>
+        <w:tc>
+          <w:tcPr>
+            <w:tcW w:type="dxa" w:w="3004"/>
+            <w:tcBorders>
+              <w:top w:val="single" w:color="A6A6A6" w:sz="4"/>
+              <w:left w:val="single" w:color="A6A6A6" w:sz="4"/>
+              <w:bottom w:val="single" w:color="A6A6A6" w:sz="4"/>
+              <w:right w:val="single" w:color="A6A6A6" w:sz="4"/>
+            </w:tcBorders>
+            <w:tcMar>
+              <w:top w:type="dxa" w:w="60"/>
+              <w:left w:type="dxa" w:w="100"/>
+              <w:bottom w:type="dxa" w:w="60"/>
+              <w:right w:type="dxa" w:w="100"/>
+            </w:tcMar>
+            <w:vAlign w:val="top"/>
+          </w:tcPr>
+          <w:p>
+            <w:pPr>
+              <w:spacing w:after="20" w:line="270"/>
+            </w:pPr>
+            <w:r>
+              <w:rPr>
+                <w:rFonts w:ascii="Arial" w:cs="Arial" w:eastAsia="Arial" w:hAnsi="Arial"/>
+                <w:sz w:val="19"/>
+                <w:szCs w:val="19"/>
+              </w:rPr>
+              <w:t xml:space="preserve">Mật khẩu mới trùng mật khẩu cũ / không đủ mạnh</w:t>
+            </w:r>
+          </w:p>
+        </w:tc>
+        <w:tc>
+          <w:tcPr>
+            <w:tcW w:type="dxa" w:w="6634"/>
+            <w:tcBorders>
+              <w:top w:val="single" w:color="A6A6A6" w:sz="4"/>
+              <w:left w:val="single" w:color="A6A6A6" w:sz="4"/>
+              <w:bottom w:val="single" w:color="A6A6A6" w:sz="4"/>
+              <w:right w:val="single" w:color="A6A6A6" w:sz="4"/>
+            </w:tcBorders>
+            <w:tcMar>
+              <w:top w:type="dxa" w:w="60"/>
+              <w:left w:type="dxa" w:w="100"/>
+              <w:bottom w:type="dxa" w:w="60"/>
+              <w:right w:type="dxa" w:w="100"/>
+            </w:tcMar>
+            <w:vAlign w:val="top"/>
+          </w:tcPr>
+          <w:p>
+            <w:pPr>
+              <w:spacing w:after="20" w:line="270"/>
+            </w:pPr>
+            <w:r>
+              <w:rPr>
+                <w:rFonts w:ascii="Arial" w:cs="Arial" w:eastAsia="Arial" w:hAnsi="Arial"/>
+                <w:sz w:val="19"/>
+                <w:szCs w:val="19"/>
+              </w:rPr>
+              <w:t xml:space="preserve">Báo lỗi tại ô, nút Đổi mật khẩu không bật.</w:t>
+            </w:r>
+          </w:p>
+        </w:tc>
+      </w:tr>
+      <w:tr>
+        <w:trPr>
+          <w:cantSplit/>
+        </w:trPr>
+        <w:tc>
+          <w:tcPr>
+            <w:tcW w:type="dxa" w:w="3004"/>
             <w:tcBorders>
               <w:top w:val="single" w:color="A6A6A6" w:sz="4"/>
               <w:left w:val="single" w:color="A6A6A6" w:sz="4"/>
@@ -2291,7 +3000,7 @@
         </w:tc>
         <w:tc>
           <w:tcPr>
-            <w:tcW w:type="dxa" w:w="6024"/>
+            <w:tcW w:type="dxa" w:w="6634"/>
             <w:tcBorders>
               <w:top w:val="single" w:color="A6A6A6" w:sz="4"/>
               <w:left w:val="single" w:color="A6A6A6" w:sz="4"/>
@@ -2322,6 +3031,11 @@
         </w:tc>
       </w:tr>
     </w:tbl>
+    <w:p>
+      <w:pPr>
+        <w:spacing w:after="60"/>
+      </w:pPr>
+    </w:p>
     <w:p>
       <w:pPr>
         <w:pStyle w:val="Heading1"/>
@@ -2345,7 +3059,7 @@
         <w:pStyle w:val="ListParagraph"/>
         <w:numPr>
           <w:ilvl w:val="0"/>
-          <w:numId w:val="2"/>
+          <w:numId w:val="1"/>
         </w:numPr>
         <w:spacing w:after="60" w:line="290"/>
       </w:pPr>
@@ -2355,7 +3069,7 @@
           <w:sz w:val="21"/>
           <w:szCs w:val="21"/>
         </w:rPr>
-        <w:t xml:space="preserve">Mật khẩu chỉ gửi một lần khi đăng nhập và lưu dạng băm (bcrypt) ở máy chủ; trình duyệt không giữ mật khẩu. Cờ "bắt đổi mật khẩu" (ATL-22) đã được lưu nhưng chưa có màn hình buộc đổi mật khẩu khi đăng nhập.</w:t>
+        <w:t xml:space="preserve">Mật khẩu chỉ gửi khi đăng nhập / đổi mật khẩu và lưu dạng băm (bcrypt) ở máy chủ; trình duyệt không giữ mật khẩu.</w:t>
       </w:r>
     </w:p>
     <w:p>
@@ -2363,7 +3077,25 @@
         <w:pStyle w:val="ListParagraph"/>
         <w:numPr>
           <w:ilvl w:val="0"/>
-          <w:numId w:val="2"/>
+          <w:numId w:val="1"/>
+        </w:numPr>
+        <w:spacing w:after="60" w:line="290"/>
+      </w:pPr>
+      <w:r>
+        <w:rPr>
+          <w:rFonts w:ascii="Arial" w:cs="Arial" w:eastAsia="Arial" w:hAnsi="Arial"/>
+          <w:sz w:val="21"/>
+          <w:szCs w:val="21"/>
+        </w:rPr>
+        <w:t xml:space="preserve">Chủ nền tảng đăng nhập ở trang riêng /quan-tri-nen-tang bằng mật khẩu + mã TOTP (ATL-34); phiên đó không dùng được cho API của doanh nghiệp và ngược lại.</w:t>
+      </w:r>
+    </w:p>
+    <w:p>
+      <w:pPr>
+        <w:pStyle w:val="ListParagraph"/>
+        <w:numPr>
+          <w:ilvl w:val="0"/>
+          <w:numId w:val="1"/>
         </w:numPr>
         <w:spacing w:after="60" w:line="290"/>
       </w:pPr>
@@ -2426,7 +3158,7 @@
 </file>
 
 <file path=word/footer1.xml><?xml version="1.0" encoding="utf-8"?>
-<w:ftr xmlns:wpc="http://schemas.microsoft.com/office/word/2010/wordprocessingCanvas" xmlns:mc="http://schemas.openxmlformats.org/markup-compatibility/2006" xmlns:o="urn:schemas-microsoft-com:office:office" xmlns:r="http://schemas.openxmlformats.org/officeDocument/2006/relationships" xmlns:m="http://schemas.openxmlformats.org/officeDocument/2006/math" xmlns:v="urn:schemas-microsoft-com:vml" xmlns:wp14="http://schemas.microsoft.com/office/word/2010/wordprocessingDrawing" xmlns:wp="http://schemas.openxmlformats.org/drawingml/2006/wordprocessingDrawing" xmlns:w10="urn:schemas-microsoft-com:office:word" xmlns:w="http://schemas.openxmlformats.org/wordprocessingml/2006/main" xmlns:w14="http://schemas.microsoft.com/office/word/2010/wordml" xmlns:w15="http://schemas.microsoft.com/office/word/2012/wordml" xmlns:wpg="http://schemas.microsoft.com/office/word/2010/wordprocessingGroup" xmlns:wpi="http://schemas.microsoft.com/office/word/2010/wordprocessingInk" xmlns:wne="http://schemas.microsoft.com/office/word/2006/wordml" xmlns:wps="http://schemas.microsoft.com/office/word/2010/wordprocessingShape">
+<w:ftr xmlns:r="http://schemas.openxmlformats.org/officeDocument/2006/relationships" xmlns:w="http://schemas.openxmlformats.org/wordprocessingml/2006/main">
   <w:p>
     <w:pPr>
       <w:jc w:val="center"/>
@@ -2466,6 +3198,15 @@
         <w:szCs w:val="17"/>
       </w:rPr>
       <w:fldChar w:fldCharType="separate"/>
+    </w:r>
+    <w:r>
+      <w:rPr>
+        <w:rFonts w:ascii="Arial" w:cs="Arial" w:eastAsia="Arial" w:hAnsi="Arial"/>
+        <w:color w:val="7F7F7F"/>
+        <w:sz w:val="17"/>
+        <w:szCs w:val="17"/>
+      </w:rPr>
+      <w:t>1</w:t>
     </w:r>
     <w:r>
       <w:rPr>
@@ -2519,6 +3260,15 @@
         <w:sz w:val="17"/>
         <w:szCs w:val="17"/>
       </w:rPr>
+      <w:t>1</w:t>
+    </w:r>
+    <w:r>
+      <w:rPr>
+        <w:rFonts w:ascii="Arial" w:cs="Arial" w:eastAsia="Arial" w:hAnsi="Arial"/>
+        <w:color w:val="7F7F7F"/>
+        <w:sz w:val="17"/>
+        <w:szCs w:val="17"/>
+      </w:rPr>
       <w:fldChar w:fldCharType="end"/>
     </w:r>
   </w:p>
@@ -2563,7 +3313,7 @@
 </file>
 
 <file path=word/header1.xml><?xml version="1.0" encoding="utf-8"?>
-<w:hdr xmlns:wpc="http://schemas.microsoft.com/office/word/2010/wordprocessingCanvas" xmlns:mc="http://schemas.openxmlformats.org/markup-compatibility/2006" xmlns:o="urn:schemas-microsoft-com:office:office" xmlns:r="http://schemas.openxmlformats.org/officeDocument/2006/relationships" xmlns:m="http://schemas.openxmlformats.org/officeDocument/2006/math" xmlns:v="urn:schemas-microsoft-com:vml" xmlns:wp14="http://schemas.microsoft.com/office/word/2010/wordprocessingDrawing" xmlns:wp="http://schemas.openxmlformats.org/drawingml/2006/wordprocessingDrawing" xmlns:w10="urn:schemas-microsoft-com:office:word" xmlns:w="http://schemas.openxmlformats.org/wordprocessingml/2006/main" xmlns:w14="http://schemas.microsoft.com/office/word/2010/wordml" xmlns:w15="http://schemas.microsoft.com/office/word/2012/wordml" xmlns:wpg="http://schemas.microsoft.com/office/word/2010/wordprocessingGroup" xmlns:wpi="http://schemas.microsoft.com/office/word/2010/wordprocessingInk" xmlns:wne="http://schemas.microsoft.com/office/word/2006/wordml" xmlns:wps="http://schemas.microsoft.com/office/word/2010/wordprocessingShape" xmlns:cx="http://schemas.microsoft.com/office/drawing/2014/chartex" xmlns:cx1="http://schemas.microsoft.com/office/drawing/2015/9/8/chartex" xmlns:cx2="http://schemas.microsoft.com/office/drawing/2015/10/21/chartex" xmlns:cx3="http://schemas.microsoft.com/office/drawing/2016/5/9/chartex" xmlns:cx4="http://schemas.microsoft.com/office/drawing/2016/5/10/chartex" xmlns:cx5="http://schemas.microsoft.com/office/drawing/2016/5/11/chartex" xmlns:cx6="http://schemas.microsoft.com/office/drawing/2016/5/12/chartex" xmlns:cx7="http://schemas.microsoft.com/office/drawing/2016/5/13/chartex" xmlns:cx8="http://schemas.microsoft.com/office/drawing/2016/5/14/chartex" xmlns:w16cid="http://schemas.microsoft.com/office/word/2016/wordml/cid" xmlns:w16se="http://schemas.microsoft.com/office/word/2015/wordml/symex">
+<w:hdr xmlns:r="http://schemas.openxmlformats.org/officeDocument/2006/relationships" xmlns:w="http://schemas.openxmlformats.org/wordprocessingml/2006/main">
   <w:p>
     <w:pPr>
       <w:pBdr>
@@ -2589,101 +3339,18 @@
         <w:sz w:val="17"/>
         <w:szCs w:val="17"/>
       </w:rPr>
-      <w:t xml:space="preserve">	ATL-01 · Đăng nhập &amp; phiên làm việc</w:t>
+      <w:tab/>
+      <w:t xml:space="preserve">ATL-01 · Đăng nhập &amp; phiên làm việc</w:t>
     </w:r>
   </w:p>
 </w:hdr>
 </file>
 
 <file path=word/numbering.xml><?xml version="1.0" encoding="utf-8"?>
-<w:numbering xmlns:wpc="http://schemas.microsoft.com/office/word/2010/wordprocessingCanvas" xmlns:mc="http://schemas.openxmlformats.org/markup-compatibility/2006" xmlns:o="urn:schemas-microsoft-com:office:office" xmlns:r="http://schemas.openxmlformats.org/officeDocument/2006/relationships" xmlns:m="http://schemas.openxmlformats.org/officeDocument/2006/math" xmlns:v="urn:schemas-microsoft-com:vml" xmlns:wp14="http://schemas.microsoft.com/office/word/2010/wordprocessingDrawing" xmlns:wp="http://schemas.openxmlformats.org/drawingml/2006/wordprocessingDrawing" xmlns:w10="urn:schemas-microsoft-com:office:word" xmlns:w="http://schemas.openxmlformats.org/wordprocessingml/2006/main" xmlns:w14="http://schemas.microsoft.com/office/word/2010/wordml" xmlns:w15="http://schemas.microsoft.com/office/word/2012/wordml" xmlns:wpg="http://schemas.microsoft.com/office/word/2010/wordprocessingGroup" xmlns:wpi="http://schemas.microsoft.com/office/word/2010/wordprocessingInk" xmlns:wne="http://schemas.microsoft.com/office/word/2006/wordml" xmlns:wps="http://schemas.microsoft.com/office/word/2010/wordprocessingShape" mc:Ignorable="w14 w15 wp14">
-  <w:abstractNum w:abstractNumId="1" w15:restartNumberingAfterBreak="0">
-    <w:multiLevelType w:val="hybridMultilevel"/>
-    <w:lvl w:ilvl="0" w:tentative="1">
-      <w:start w:val="1"/>
-      <w:numFmt w:val="bullet"/>
-      <w:lvlText w:val="●"/>
-      <w:lvlJc w:val="left"/>
-      <w:pPr>
-        <w:ind w:left="720" w:hanging="360"/>
-      </w:pPr>
-    </w:lvl>
-    <w:lvl w:ilvl="1" w:tentative="1">
-      <w:start w:val="1"/>
-      <w:numFmt w:val="bullet"/>
-      <w:lvlText w:val="○"/>
-      <w:lvlJc w:val="left"/>
-      <w:pPr>
-        <w:ind w:left="1440" w:hanging="360"/>
-      </w:pPr>
-    </w:lvl>
-    <w:lvl w:ilvl="2" w:tentative="1">
-      <w:start w:val="1"/>
-      <w:numFmt w:val="bullet"/>
-      <w:lvlText w:val="■"/>
-      <w:lvlJc w:val="left"/>
-      <w:pPr>
-        <w:ind w:left="2160" w:hanging="360"/>
-      </w:pPr>
-    </w:lvl>
-    <w:lvl w:ilvl="3" w:tentative="1">
-      <w:start w:val="1"/>
-      <w:numFmt w:val="bullet"/>
-      <w:lvlText w:val="●"/>
-      <w:lvlJc w:val="left"/>
-      <w:pPr>
-        <w:ind w:left="2880" w:hanging="360"/>
-      </w:pPr>
-    </w:lvl>
-    <w:lvl w:ilvl="4" w:tentative="1">
-      <w:start w:val="1"/>
-      <w:numFmt w:val="bullet"/>
-      <w:lvlText w:val="○"/>
-      <w:lvlJc w:val="left"/>
-      <w:pPr>
-        <w:ind w:left="3600" w:hanging="360"/>
-      </w:pPr>
-    </w:lvl>
-    <w:lvl w:ilvl="5" w:tentative="1">
-      <w:start w:val="1"/>
-      <w:numFmt w:val="bullet"/>
-      <w:lvlText w:val="■"/>
-      <w:lvlJc w:val="left"/>
-      <w:pPr>
-        <w:ind w:left="4320" w:hanging="360"/>
-      </w:pPr>
-    </w:lvl>
-    <w:lvl w:ilvl="6" w:tentative="1">
-      <w:start w:val="1"/>
-      <w:numFmt w:val="bullet"/>
-      <w:lvlText w:val="●"/>
-      <w:lvlJc w:val="left"/>
-      <w:pPr>
-        <w:ind w:left="5040" w:hanging="360"/>
-      </w:pPr>
-    </w:lvl>
-    <w:lvl w:ilvl="7" w:tentative="1">
-      <w:start w:val="1"/>
-      <w:numFmt w:val="bullet"/>
-      <w:lvlText w:val="●"/>
-      <w:lvlJc w:val="left"/>
-      <w:pPr>
-        <w:ind w:left="5760" w:hanging="360"/>
-      </w:pPr>
-    </w:lvl>
-    <w:lvl w:ilvl="8" w:tentative="1">
-      <w:start w:val="1"/>
-      <w:numFmt w:val="bullet"/>
-      <w:lvlText w:val="●"/>
-      <w:lvlJc w:val="left"/>
-      <w:pPr>
-        <w:ind w:left="6480" w:hanging="360"/>
-      </w:pPr>
-    </w:lvl>
-  </w:abstractNum>
-  <w:abstractNum w:abstractNumId="2" w15:restartNumberingAfterBreak="0">
-    <w:multiLevelType w:val="hybridMultilevel"/>
-    <w:lvl w:ilvl="0" w:tentative="1">
+<w:numbering xmlns:r="http://schemas.openxmlformats.org/officeDocument/2006/relationships" xmlns:w="http://schemas.openxmlformats.org/wordprocessingml/2006/main">
+  <w:abstractNum w:abstractNumId="1">
+    <w:multiLevelType w:val="singleLevel"/>
+    <w:lvl w:ilvl="0">
       <w:start w:val="1"/>
       <w:numFmt w:val="bullet"/>
       <w:lvlText w:val="•"/>
@@ -2693,9 +3360,9 @@
       </w:pPr>
     </w:lvl>
   </w:abstractNum>
-  <w:abstractNum w:abstractNumId="3" w15:restartNumberingAfterBreak="0">
-    <w:multiLevelType w:val="hybridMultilevel"/>
-    <w:lvl w:ilvl="0" w:tentative="1">
+  <w:abstractNum w:abstractNumId="2">
+    <w:multiLevelType w:val="singleLevel"/>
+    <w:lvl w:ilvl="0">
       <w:start w:val="1"/>
       <w:numFmt w:val="decimal"/>
       <w:lvlText w:val="%1."/>
@@ -2707,18 +3374,9 @@
   </w:abstractNum>
   <w:num w:numId="1">
     <w:abstractNumId w:val="1"/>
-    <w:lvlOverride w:ilvl="0">
-      <w:startOverride w:val="1"/>
-    </w:lvlOverride>
   </w:num>
   <w:num w:numId="2">
     <w:abstractNumId w:val="2"/>
-    <w:lvlOverride w:ilvl="0">
-      <w:startOverride w:val="1"/>
-    </w:lvlOverride>
-  </w:num>
-  <w:num w:numId="3">
-    <w:abstractNumId w:val="3"/>
     <w:lvlOverride w:ilvl="0">
       <w:startOverride w:val="1"/>
     </w:lvlOverride>

</xml_diff>